<commit_message>
docs: update project documentation for clarity and formatting
</commit_message>
<xml_diff>
--- a/deliverables/docs/Descrição do Projeto Semestral de POO.docx
+++ b/deliverables/docs/Descrição do Projeto Semestral de POO.docx
@@ -17,11 +17,19 @@
         </w:rPr>
         <w:t>Descrição do Projeto Semestral de POO</w:t>
       </w:r>
-      <w:r>
-        <w:rPr>
-          <w:lang w:val="pt-BR"/>
-        </w:rPr>
-        <w:t xml:space="preserve">   (25/08/2026)</w:t>
+      <w:proofErr w:type="gramStart"/>
+      <w:r>
+        <w:rPr>
+          <w:lang w:val="pt-BR"/>
+        </w:rPr>
+        <w:t xml:space="preserve">   (</w:t>
+      </w:r>
+      <w:proofErr w:type="gramEnd"/>
+      <w:r>
+        <w:rPr>
+          <w:lang w:val="pt-BR"/>
+        </w:rPr>
+        <w:t>25/08/2026)</w:t>
       </w:r>
     </w:p>
     <w:p>
@@ -87,7 +95,25 @@
           <w:bCs/>
           <w:lang w:val="pt-BR"/>
         </w:rPr>
-        <w:t>Nexo Invest — Simulador de Investimentos e Planejamento Financeiro</w:t>
+        <w:t xml:space="preserve">Nexo </w:t>
+      </w:r>
+      <w:proofErr w:type="spellStart"/>
+      <w:r>
+        <w:rPr>
+          <w:b/>
+          <w:bCs/>
+          <w:lang w:val="pt-BR"/>
+        </w:rPr>
+        <w:t>Invest</w:t>
+      </w:r>
+      <w:proofErr w:type="spellEnd"/>
+      <w:r>
+        <w:rPr>
+          <w:b/>
+          <w:bCs/>
+          <w:lang w:val="pt-BR"/>
+        </w:rPr>
+        <w:t xml:space="preserve"> — Simulador de Investimentos e Planejamento Financeiro</w:t>
       </w:r>
     </w:p>
     <w:p>
@@ -209,10 +235,9 @@
           <w:noProof/>
           <w:lang w:val="pt-BR"/>
         </w:rPr>
-        <w:lastRenderedPageBreak/>
         <w:drawing>
-          <wp:inline distT="0" distB="0" distL="0" distR="0" wp14:anchorId="3132C8AD" wp14:editId="6F86B4DB">
-            <wp:extent cx="4374958" cy="3095625"/>
+          <wp:inline distT="0" distB="0" distL="0" distR="0" wp14:anchorId="3132C8AD" wp14:editId="580E6C61">
+            <wp:extent cx="4022972" cy="2846567"/>
             <wp:effectExtent l="0" t="0" r="0" b="0"/>
             <wp:docPr id="1302684277" name="Imagem 1"/>
             <wp:cNvGraphicFramePr>
@@ -243,7 +268,7 @@
                   <pic:spPr bwMode="auto">
                     <a:xfrm>
                       <a:off x="0" y="0"/>
-                      <a:ext cx="4395038" cy="3109833"/>
+                      <a:ext cx="4045109" cy="2862231"/>
                     </a:xfrm>
                     <a:prstGeom prst="rect">
                       <a:avLst/>
@@ -271,6 +296,7 @@
         <w:rPr>
           <w:lang w:val="pt-BR"/>
         </w:rPr>
+        <w:lastRenderedPageBreak/>
         <w:t>3. Objetivo principal</w:t>
       </w:r>
     </w:p>
@@ -504,155 +530,155 @@
         <w:rPr>
           <w:lang w:val="pt-BR"/>
         </w:rPr>
+        <w:t>realização de cálculos de apoio à análise de investimentos, incluindo estimativas de preço-teto e outros indicadores;</w:t>
+      </w:r>
+    </w:p>
+    <w:p>
+      <w:pPr>
+        <w:pStyle w:val="Compact"/>
+        <w:numPr>
+          <w:ilvl w:val="0"/>
+          <w:numId w:val="2"/>
+        </w:numPr>
+        <w:jc w:val="both"/>
+        <w:rPr>
+          <w:lang w:val="pt-BR"/>
+        </w:rPr>
+      </w:pPr>
+      <w:r>
+        <w:rPr>
+          <w:lang w:val="pt-BR"/>
+        </w:rPr>
+        <w:t>criação de uma área específica para análise detalhada de ativos;</w:t>
+      </w:r>
+    </w:p>
+    <w:p>
+      <w:pPr>
+        <w:pStyle w:val="Compact"/>
+        <w:numPr>
+          <w:ilvl w:val="0"/>
+          <w:numId w:val="2"/>
+        </w:numPr>
+        <w:jc w:val="both"/>
+        <w:rPr>
+          <w:lang w:val="pt-BR"/>
+        </w:rPr>
+      </w:pPr>
+      <w:r>
+        <w:rPr>
+          <w:lang w:val="pt-BR"/>
+        </w:rPr>
+        <w:t>armazenamento persistente das carteiras, operações e configurações do usuário;</w:t>
+      </w:r>
+    </w:p>
+    <w:p>
+      <w:pPr>
+        <w:pStyle w:val="Compact"/>
+        <w:numPr>
+          <w:ilvl w:val="0"/>
+          <w:numId w:val="2"/>
+        </w:numPr>
+        <w:jc w:val="both"/>
+        <w:rPr>
+          <w:lang w:val="pt-BR"/>
+        </w:rPr>
+      </w:pPr>
+      <w:r>
+        <w:rPr>
+          <w:lang w:val="pt-BR"/>
+        </w:rPr>
+        <w:t>validação de dados inseridos e tratamento de situações de erro, como indisponibilidade do serviço externo ou código de ativo inexistente;</w:t>
+      </w:r>
+    </w:p>
+    <w:p>
+      <w:pPr>
+        <w:pStyle w:val="Compact"/>
+        <w:numPr>
+          <w:ilvl w:val="0"/>
+          <w:numId w:val="2"/>
+        </w:numPr>
+        <w:jc w:val="both"/>
+        <w:rPr>
+          <w:lang w:val="pt-BR"/>
+        </w:rPr>
+      </w:pPr>
+      <w:r>
+        <w:rPr>
+          <w:lang w:val="pt-BR"/>
+        </w:rPr>
+        <w:t>possibilidade de criação de alertas configuráveis relacionados ao preço dos ativos.</w:t>
+      </w:r>
+    </w:p>
+    <w:p>
+      <w:pPr>
+        <w:pStyle w:val="FirstParagraph"/>
+        <w:jc w:val="both"/>
+        <w:rPr>
+          <w:lang w:val="pt-BR"/>
+        </w:rPr>
+      </w:pPr>
+      <w:r>
+        <w:rPr>
+          <w:lang w:val="pt-BR"/>
+        </w:rPr>
+        <w:t>Como funcionalidades adicionais, caso o cronograma de desenvolvimento permita, pretende-se implementar:</w:t>
+      </w:r>
+    </w:p>
+    <w:p>
+      <w:pPr>
+        <w:pStyle w:val="Compact"/>
+        <w:numPr>
+          <w:ilvl w:val="0"/>
+          <w:numId w:val="3"/>
+        </w:numPr>
+        <w:jc w:val="both"/>
+        <w:rPr>
+          <w:lang w:val="pt-BR"/>
+        </w:rPr>
+      </w:pPr>
+      <w:r>
+        <w:rPr>
+          <w:lang w:val="pt-BR"/>
+        </w:rPr>
+        <w:t>envio de alertas através de e-mail ou serviço de mensagens;</w:t>
+      </w:r>
+    </w:p>
+    <w:p>
+      <w:pPr>
+        <w:pStyle w:val="Compact"/>
+        <w:numPr>
+          <w:ilvl w:val="0"/>
+          <w:numId w:val="3"/>
+        </w:numPr>
+        <w:jc w:val="both"/>
+        <w:rPr>
+          <w:lang w:val="pt-BR"/>
+        </w:rPr>
+      </w:pPr>
+      <w:r>
+        <w:rPr>
+          <w:lang w:val="pt-BR"/>
+        </w:rPr>
+        <w:t>módulo de planejamento financeiro pessoal, relacionando receitas, despesas, objetivos e investimentos;</w:t>
+      </w:r>
+    </w:p>
+    <w:p>
+      <w:pPr>
+        <w:pStyle w:val="Compact"/>
+        <w:numPr>
+          <w:ilvl w:val="0"/>
+          <w:numId w:val="3"/>
+        </w:numPr>
+        <w:jc w:val="both"/>
+        <w:rPr>
+          <w:lang w:val="pt-BR"/>
+        </w:rPr>
+      </w:pPr>
+      <w:r>
+        <w:rPr>
+          <w:lang w:val="pt-BR"/>
+        </w:rPr>
         <w:lastRenderedPageBreak/>
-        <w:t>realização de cálculos de apoio à análise de investimentos, incluindo estimativas de preço-teto e outros indicadores;</w:t>
-      </w:r>
-    </w:p>
-    <w:p>
-      <w:pPr>
-        <w:pStyle w:val="Compact"/>
-        <w:numPr>
-          <w:ilvl w:val="0"/>
-          <w:numId w:val="2"/>
-        </w:numPr>
-        <w:jc w:val="both"/>
-        <w:rPr>
-          <w:lang w:val="pt-BR"/>
-        </w:rPr>
-      </w:pPr>
-      <w:r>
-        <w:rPr>
-          <w:lang w:val="pt-BR"/>
-        </w:rPr>
-        <w:t>criação de uma área específica para análise detalhada de ativos;</w:t>
-      </w:r>
-    </w:p>
-    <w:p>
-      <w:pPr>
-        <w:pStyle w:val="Compact"/>
-        <w:numPr>
-          <w:ilvl w:val="0"/>
-          <w:numId w:val="2"/>
-        </w:numPr>
-        <w:jc w:val="both"/>
-        <w:rPr>
-          <w:lang w:val="pt-BR"/>
-        </w:rPr>
-      </w:pPr>
-      <w:r>
-        <w:rPr>
-          <w:lang w:val="pt-BR"/>
-        </w:rPr>
-        <w:t>armazenamento persistente das carteiras, operações e configurações do usuário;</w:t>
-      </w:r>
-    </w:p>
-    <w:p>
-      <w:pPr>
-        <w:pStyle w:val="Compact"/>
-        <w:numPr>
-          <w:ilvl w:val="0"/>
-          <w:numId w:val="2"/>
-        </w:numPr>
-        <w:jc w:val="both"/>
-        <w:rPr>
-          <w:lang w:val="pt-BR"/>
-        </w:rPr>
-      </w:pPr>
-      <w:r>
-        <w:rPr>
-          <w:lang w:val="pt-BR"/>
-        </w:rPr>
-        <w:t>validação de dados inseridos e tratamento de situações de erro, como indisponibilidade do serviço externo ou código de ativo inexistente;</w:t>
-      </w:r>
-    </w:p>
-    <w:p>
-      <w:pPr>
-        <w:pStyle w:val="Compact"/>
-        <w:numPr>
-          <w:ilvl w:val="0"/>
-          <w:numId w:val="2"/>
-        </w:numPr>
-        <w:jc w:val="both"/>
-        <w:rPr>
-          <w:lang w:val="pt-BR"/>
-        </w:rPr>
-      </w:pPr>
-      <w:r>
-        <w:rPr>
-          <w:lang w:val="pt-BR"/>
-        </w:rPr>
-        <w:t>possibilidade de criação de alertas configuráveis relacionados ao preço dos ativos.</w:t>
-      </w:r>
-    </w:p>
-    <w:p>
-      <w:pPr>
-        <w:pStyle w:val="FirstParagraph"/>
-        <w:jc w:val="both"/>
-        <w:rPr>
-          <w:lang w:val="pt-BR"/>
-        </w:rPr>
-      </w:pPr>
-      <w:r>
-        <w:rPr>
-          <w:lang w:val="pt-BR"/>
-        </w:rPr>
-        <w:t>Como funcionalidades adicionais, caso o cronograma de desenvolvimento permita, pretende-se implementar:</w:t>
-      </w:r>
-    </w:p>
-    <w:p>
-      <w:pPr>
-        <w:pStyle w:val="Compact"/>
-        <w:numPr>
-          <w:ilvl w:val="0"/>
-          <w:numId w:val="3"/>
-        </w:numPr>
-        <w:jc w:val="both"/>
-        <w:rPr>
-          <w:lang w:val="pt-BR"/>
-        </w:rPr>
-      </w:pPr>
-      <w:r>
-        <w:rPr>
-          <w:lang w:val="pt-BR"/>
-        </w:rPr>
-        <w:t>envio de alertas através de e-mail ou serviço de mensagens;</w:t>
-      </w:r>
-    </w:p>
-    <w:p>
-      <w:pPr>
-        <w:pStyle w:val="Compact"/>
-        <w:numPr>
-          <w:ilvl w:val="0"/>
-          <w:numId w:val="3"/>
-        </w:numPr>
-        <w:jc w:val="both"/>
-        <w:rPr>
-          <w:lang w:val="pt-BR"/>
-        </w:rPr>
-      </w:pPr>
-      <w:r>
-        <w:rPr>
-          <w:lang w:val="pt-BR"/>
-        </w:rPr>
-        <w:t>módulo de planejamento financeiro pessoal, relacionando receitas, despesas, objetivos e investimentos;</w:t>
-      </w:r>
-    </w:p>
-    <w:p>
-      <w:pPr>
-        <w:pStyle w:val="Compact"/>
-        <w:numPr>
-          <w:ilvl w:val="0"/>
-          <w:numId w:val="3"/>
-        </w:numPr>
-        <w:jc w:val="both"/>
-        <w:rPr>
-          <w:lang w:val="pt-BR"/>
-        </w:rPr>
-      </w:pPr>
-      <w:r>
-        <w:rPr>
-          <w:lang w:val="pt-BR"/>
-        </w:rPr>
         <w:t>integração com um modelo de linguagem para geração de explicações e análises auxiliares relacionadas ao portfólio e à educação financeira.</w:t>
       </w:r>
     </w:p>
@@ -742,6 +768,7 @@
           <w:lang w:val="pt-BR"/>
         </w:rPr>
       </w:pPr>
+      <w:proofErr w:type="spellStart"/>
       <w:r>
         <w:rPr>
           <w:b/>
@@ -750,6 +777,7 @@
         </w:rPr>
         <w:t>SQLite</w:t>
       </w:r>
+      <w:proofErr w:type="spellEnd"/>
       <w:r>
         <w:rPr>
           <w:lang w:val="pt-BR"/>
@@ -765,42 +793,29 @@
           <w:lang w:val="pt-BR"/>
         </w:rPr>
       </w:pPr>
+      <w:proofErr w:type="spellStart"/>
       <w:r>
         <w:rPr>
           <w:b/>
           <w:bCs/>
           <w:lang w:val="pt-BR"/>
         </w:rPr>
-        <w:t>Requests, HTTPX ou biblioteca equivalente</w:t>
-      </w:r>
-      <w:r>
-        <w:rPr>
-          <w:lang w:val="pt-BR"/>
-        </w:rPr>
-        <w:t xml:space="preserve"> para comunicação com serviços externos;</w:t>
-      </w:r>
-    </w:p>
-    <w:p>
-      <w:pPr>
-        <w:pStyle w:val="Corpodetexto"/>
-        <w:jc w:val="both"/>
-        <w:rPr>
-          <w:lang w:val="pt-BR"/>
-        </w:rPr>
-      </w:pPr>
+        <w:t>Requests</w:t>
+      </w:r>
+      <w:proofErr w:type="spellEnd"/>
       <w:r>
         <w:rPr>
           <w:b/>
           <w:bCs/>
           <w:lang w:val="pt-BR"/>
         </w:rPr>
-        <w:t>API ou serviço de informações do mercado financeiro</w:t>
-      </w:r>
-      <w:r>
-        <w:rPr>
-          <w:lang w:val="pt-BR"/>
-        </w:rPr>
-        <w:t xml:space="preserve"> para obtenção das cotações e informações dos ativos;</w:t>
+        <w:t>, HTTPX ou biblioteca equivalente</w:t>
+      </w:r>
+      <w:r>
+        <w:rPr>
+          <w:lang w:val="pt-BR"/>
+        </w:rPr>
+        <w:t xml:space="preserve"> para comunicação com serviços externos;</w:t>
       </w:r>
     </w:p>
     <w:p>
@@ -817,7 +832,58 @@
           <w:bCs/>
           <w:lang w:val="pt-BR"/>
         </w:rPr>
-        <w:t>Matplotlib, PyQtGraph ou biblioteca equivalente</w:t>
+        <w:t>API ou serviço de informações do mercado financeiro</w:t>
+      </w:r>
+      <w:r>
+        <w:rPr>
+          <w:lang w:val="pt-BR"/>
+        </w:rPr>
+        <w:t xml:space="preserve"> para obtenção das cotações e informações dos ativos;</w:t>
+      </w:r>
+    </w:p>
+    <w:p>
+      <w:pPr>
+        <w:pStyle w:val="Corpodetexto"/>
+        <w:jc w:val="both"/>
+        <w:rPr>
+          <w:lang w:val="pt-BR"/>
+        </w:rPr>
+      </w:pPr>
+      <w:proofErr w:type="spellStart"/>
+      <w:r>
+        <w:rPr>
+          <w:b/>
+          <w:bCs/>
+          <w:lang w:val="pt-BR"/>
+        </w:rPr>
+        <w:t>Matplotlib</w:t>
+      </w:r>
+      <w:proofErr w:type="spellEnd"/>
+      <w:r>
+        <w:rPr>
+          <w:b/>
+          <w:bCs/>
+          <w:lang w:val="pt-BR"/>
+        </w:rPr>
+        <w:t xml:space="preserve">, </w:t>
+      </w:r>
+      <w:proofErr w:type="spellStart"/>
+      <w:r>
+        <w:rPr>
+          <w:b/>
+          <w:bCs/>
+          <w:lang w:val="pt-BR"/>
+        </w:rPr>
+        <w:t>PyQtGraph</w:t>
+      </w:r>
+      <w:proofErr w:type="spellEnd"/>
+      <w:r>
+        <w:rPr>
+          <w:b/>
+          <w:bCs/>
+          <w:lang w:val="pt-BR"/>
+        </w:rPr>
+        <w:t xml:space="preserve"> ou biblioteca equivalente</w:t>
       </w:r>
       <w:r>
         <w:rPr>
@@ -870,7 +936,6 @@
         <w:rPr>
           <w:lang w:val="pt-BR"/>
         </w:rPr>
-        <w:lastRenderedPageBreak/>
         <w:t>6. Utilização de Programação Orientada a Objetos</w:t>
       </w:r>
     </w:p>
@@ -1042,6 +1107,7 @@
           <w:lang w:val="pt-BR"/>
         </w:rPr>
       </w:pPr>
+      <w:proofErr w:type="spellStart"/>
       <w:r>
         <w:rPr>
           <w:b/>
@@ -1050,6 +1116,7 @@
         </w:rPr>
         <w:t>AlertaPreco</w:t>
       </w:r>
+      <w:proofErr w:type="spellEnd"/>
       <w:r>
         <w:rPr>
           <w:lang w:val="pt-BR"/>
@@ -1069,6 +1136,7 @@
         <w:rPr>
           <w:lang w:val="pt-BR"/>
         </w:rPr>
+        <w:lastRenderedPageBreak/>
         <w:t>Além de demais classes auxiliares que são:</w:t>
       </w:r>
     </w:p>
@@ -1229,6 +1297,7 @@
         </w:rPr>
         <w:t xml:space="preserve"> poderá concentrar atributos e comportamentos comuns a todos os ativos, como código, nome, preço atual e histórico de cotações. A partir dela, poderão ser criadas classes especializadas, como </w:t>
       </w:r>
+      <w:proofErr w:type="spellStart"/>
       <w:r>
         <w:rPr>
           <w:b/>
@@ -1237,6 +1306,7 @@
         </w:rPr>
         <w:t>Acao</w:t>
       </w:r>
+      <w:proofErr w:type="spellEnd"/>
       <w:r>
         <w:rPr>
           <w:lang w:val="pt-BR"/>
@@ -1285,6 +1355,7 @@
         </w:rPr>
         <w:t xml:space="preserve"> poderá armazenar dados relacionados a proventos, enquanto a classe </w:t>
       </w:r>
+      <w:proofErr w:type="spellStart"/>
       <w:r>
         <w:rPr>
           <w:b/>
@@ -1293,6 +1364,7 @@
         </w:rPr>
         <w:t>Acao</w:t>
       </w:r>
+      <w:proofErr w:type="spellEnd"/>
       <w:r>
         <w:rPr>
           <w:lang w:val="pt-BR"/>
@@ -1314,7 +1386,6 @@
           <w:bCs/>
           <w:lang w:val="pt-BR"/>
         </w:rPr>
-        <w:lastRenderedPageBreak/>
         <w:t>Polimorfismo:</w:t>
       </w:r>
       <w:r>
@@ -1337,6 +1408,7 @@
         </w:rPr>
         <w:t xml:space="preserve"> poderão implementar ou sobrescrever métodos de acordo com suas características. Um método como </w:t>
       </w:r>
+      <w:proofErr w:type="spellStart"/>
       <w:r>
         <w:rPr>
           <w:rStyle w:val="VerbatimChar"/>
@@ -1350,7 +1422,15 @@
           <w:rStyle w:val="VerbatimChar"/>
           <w:lang w:val="pt-BR"/>
         </w:rPr>
-        <w:t>rendimento(</w:t>
+        <w:t>rendimento</w:t>
+      </w:r>
+      <w:proofErr w:type="spellEnd"/>
+      <w:r>
+        <w:rPr>
+          <w:rStyle w:val="VerbatimChar"/>
+          <w:lang w:val="pt-BR"/>
+        </w:rPr>
+        <w:t>(</w:t>
       </w:r>
       <w:proofErr w:type="gramEnd"/>
       <w:r>
@@ -1366,6 +1446,7 @@
         </w:rPr>
         <w:t xml:space="preserve"> ou </w:t>
       </w:r>
+      <w:proofErr w:type="spellStart"/>
       <w:r>
         <w:rPr>
           <w:rStyle w:val="VerbatimChar"/>
@@ -1379,7 +1460,15 @@
           <w:rStyle w:val="VerbatimChar"/>
           <w:lang w:val="pt-BR"/>
         </w:rPr>
-        <w:t>indicadores(</w:t>
+        <w:t>indicadores</w:t>
+      </w:r>
+      <w:proofErr w:type="spellEnd"/>
+      <w:r>
+        <w:rPr>
+          <w:rStyle w:val="VerbatimChar"/>
+          <w:lang w:val="pt-BR"/>
+        </w:rPr>
+        <w:t>(</w:t>
       </w:r>
       <w:proofErr w:type="gramEnd"/>
       <w:r>
@@ -1395,6 +1484,7 @@
         </w:rPr>
         <w:t xml:space="preserve"> poderá existir na classe base, mas apresentar comportamentos diferentes em </w:t>
       </w:r>
+      <w:proofErr w:type="spellStart"/>
       <w:r>
         <w:rPr>
           <w:b/>
@@ -1403,6 +1493,7 @@
         </w:rPr>
         <w:t>Acao</w:t>
       </w:r>
+      <w:proofErr w:type="spellEnd"/>
       <w:r>
         <w:rPr>
           <w:lang w:val="pt-BR"/>
@@ -1466,6 +1557,7 @@
         </w:rPr>
         <w:t xml:space="preserve">O polimorfismo também poderá ser aplicado aos serviços de obtenção de dados, por meio de uma classe base como </w:t>
       </w:r>
+      <w:proofErr w:type="spellStart"/>
       <w:r>
         <w:rPr>
           <w:b/>
@@ -1474,12 +1566,14 @@
         </w:rPr>
         <w:t>MarketDataProvider</w:t>
       </w:r>
+      <w:proofErr w:type="spellEnd"/>
       <w:r>
         <w:rPr>
           <w:lang w:val="pt-BR"/>
         </w:rPr>
         <w:t xml:space="preserve"> e diferentes implementações, como </w:t>
       </w:r>
+      <w:proofErr w:type="spellStart"/>
       <w:r>
         <w:rPr>
           <w:b/>
@@ -1488,6 +1582,7 @@
         </w:rPr>
         <w:t>YahooFinanceProvider</w:t>
       </w:r>
+      <w:proofErr w:type="spellEnd"/>
       <w:r>
         <w:rPr>
           <w:lang w:val="pt-BR"/>
@@ -1531,6 +1626,7 @@
         </w:rPr>
         <w:t xml:space="preserve"> poderá ser composta por várias instâncias da classe </w:t>
       </w:r>
+      <w:proofErr w:type="spellStart"/>
       <w:r>
         <w:rPr>
           <w:b/>
@@ -1539,12 +1635,14 @@
         </w:rPr>
         <w:t>Posicao</w:t>
       </w:r>
+      <w:proofErr w:type="spellEnd"/>
       <w:r>
         <w:rPr>
           <w:lang w:val="pt-BR"/>
         </w:rPr>
         <w:t xml:space="preserve">, representando os ativos mantidos pelo usuário. Cada </w:t>
       </w:r>
+      <w:proofErr w:type="spellStart"/>
       <w:r>
         <w:rPr>
           <w:b/>
@@ -1553,6 +1651,7 @@
         </w:rPr>
         <w:t>Posicao</w:t>
       </w:r>
+      <w:proofErr w:type="spellEnd"/>
       <w:r>
         <w:rPr>
           <w:lang w:val="pt-BR"/>
@@ -1573,6 +1672,7 @@
         </w:rPr>
         <w:t xml:space="preserve">, além da quantidade, preço médio e valor atual. A carteira também poderá manter uma coleção de objetos </w:t>
       </w:r>
+      <w:proofErr w:type="spellStart"/>
       <w:r>
         <w:rPr>
           <w:b/>
@@ -1581,11 +1681,19 @@
         </w:rPr>
         <w:t>Transacao</w:t>
       </w:r>
-      <w:r>
-        <w:rPr>
-          <w:lang w:val="pt-BR"/>
-        </w:rPr>
-        <w:t>, que representarão as operações de compra e venda realizadas. Nesse caso, a carteira será responsável por organizar suas posições e transações, calculando o patrimônio, a rentabilidade e a distribuição dos investimentos.</w:t>
+      <w:proofErr w:type="spellEnd"/>
+      <w:r>
+        <w:rPr>
+          <w:lang w:val="pt-BR"/>
+        </w:rPr>
+        <w:t xml:space="preserve">, que representarão as operações de compra e venda realizadas. Nesse caso, a carteira será </w:t>
+      </w:r>
+      <w:r>
+        <w:rPr>
+          <w:lang w:val="pt-BR"/>
+        </w:rPr>
+        <w:lastRenderedPageBreak/>
+        <w:t>responsável por organizar suas posições e transações, calculando o patrimônio, a rentabilidade e a distribuição dos investimentos.</w:t>
       </w:r>
     </w:p>
     <w:p>
@@ -1610,6 +1718,7 @@
         </w:rPr>
         <w:t xml:space="preserve"> a classe </w:t>
       </w:r>
+      <w:proofErr w:type="spellStart"/>
       <w:r>
         <w:rPr>
           <w:b/>
@@ -1618,6 +1727,7 @@
         </w:rPr>
         <w:t>Posicao</w:t>
       </w:r>
+      <w:proofErr w:type="spellEnd"/>
       <w:r>
         <w:rPr>
           <w:lang w:val="pt-BR"/>
@@ -1638,6 +1748,7 @@
         </w:rPr>
         <w:t xml:space="preserve">, pois uma posição precisa identificar qual ativo está sendo mantido, mas o ativo poderá existir independentemente da carteira. Da mesma forma, uma </w:t>
       </w:r>
+      <w:proofErr w:type="spellStart"/>
       <w:r>
         <w:rPr>
           <w:b/>
@@ -1646,6 +1757,7 @@
         </w:rPr>
         <w:t>Transacao</w:t>
       </w:r>
+      <w:proofErr w:type="spellEnd"/>
       <w:r>
         <w:rPr>
           <w:lang w:val="pt-BR"/>
@@ -1680,6 +1792,7 @@
         </w:rPr>
         <w:t xml:space="preserve">, registrando em qual carteira a operação ocorreu e qual ativo foi negociado. A classe </w:t>
       </w:r>
+      <w:proofErr w:type="spellStart"/>
       <w:r>
         <w:rPr>
           <w:b/>
@@ -1688,6 +1801,7 @@
         </w:rPr>
         <w:t>AlertaPreco</w:t>
       </w:r>
+      <w:proofErr w:type="spellEnd"/>
       <w:r>
         <w:rPr>
           <w:lang w:val="pt-BR"/>
@@ -1763,8 +1877,17 @@
           <w:rStyle w:val="VerbatimChar"/>
           <w:lang w:val="pt-BR"/>
         </w:rPr>
-        <w:t>├── Acao</w:t>
-      </w:r>
+        <w:t xml:space="preserve">├── </w:t>
+      </w:r>
+      <w:proofErr w:type="spellStart"/>
+      <w:r>
+        <w:rPr>
+          <w:rStyle w:val="VerbatimChar"/>
+          <w:lang w:val="pt-BR"/>
+        </w:rPr>
+        <w:t>Acao</w:t>
+      </w:r>
+      <w:proofErr w:type="spellEnd"/>
       <w:r>
         <w:rPr>
           <w:lang w:val="pt-BR"/>
@@ -1821,8 +1944,17 @@
           <w:rStyle w:val="VerbatimChar"/>
           <w:lang w:val="pt-BR"/>
         </w:rPr>
-        <w:t>├── possui várias Posicoes</w:t>
-      </w:r>
+        <w:t xml:space="preserve">├── possui várias </w:t>
+      </w:r>
+      <w:proofErr w:type="spellStart"/>
+      <w:r>
+        <w:rPr>
+          <w:rStyle w:val="VerbatimChar"/>
+          <w:lang w:val="pt-BR"/>
+        </w:rPr>
+        <w:t>Posicoes</w:t>
+      </w:r>
+      <w:proofErr w:type="spellEnd"/>
       <w:r>
         <w:rPr>
           <w:lang w:val="pt-BR"/>
@@ -1834,8 +1966,17 @@
           <w:rStyle w:val="VerbatimChar"/>
           <w:lang w:val="pt-BR"/>
         </w:rPr>
-        <w:t>├── registra várias Transacoes</w:t>
-      </w:r>
+        <w:t xml:space="preserve">├── registra várias </w:t>
+      </w:r>
+      <w:proofErr w:type="spellStart"/>
+      <w:r>
+        <w:rPr>
+          <w:rStyle w:val="VerbatimChar"/>
+          <w:lang w:val="pt-BR"/>
+        </w:rPr>
+        <w:t>Transacoes</w:t>
+      </w:r>
+      <w:proofErr w:type="spellEnd"/>
       <w:r>
         <w:rPr>
           <w:lang w:val="pt-BR"/>
@@ -1847,8 +1988,17 @@
           <w:rStyle w:val="VerbatimChar"/>
           <w:lang w:val="pt-BR"/>
         </w:rPr>
-        <w:t>└── pode possuir vários AlertasPreco</w:t>
-      </w:r>
+        <w:t xml:space="preserve">└── pode possuir vários </w:t>
+      </w:r>
+      <w:proofErr w:type="spellStart"/>
+      <w:r>
+        <w:rPr>
+          <w:rStyle w:val="VerbatimChar"/>
+          <w:lang w:val="pt-BR"/>
+        </w:rPr>
+        <w:t>AlertasPreco</w:t>
+      </w:r>
+      <w:proofErr w:type="spellEnd"/>
       <w:r>
         <w:rPr>
           <w:lang w:val="pt-BR"/>
@@ -1861,6 +2011,7 @@
         </w:rPr>
         <w:br/>
       </w:r>
+      <w:proofErr w:type="spellStart"/>
       <w:r>
         <w:rPr>
           <w:rStyle w:val="VerbatimChar"/>
@@ -1868,6 +2019,7 @@
         </w:rPr>
         <w:t>Posicao</w:t>
       </w:r>
+      <w:proofErr w:type="spellEnd"/>
       <w:r>
         <w:rPr>
           <w:lang w:val="pt-BR"/>
@@ -1893,6 +2045,7 @@
         </w:rPr>
         <w:br/>
       </w:r>
+      <w:proofErr w:type="spellStart"/>
       <w:r>
         <w:rPr>
           <w:rStyle w:val="VerbatimChar"/>
@@ -1900,6 +2053,7 @@
         </w:rPr>
         <w:t>Transacao</w:t>
       </w:r>
+      <w:proofErr w:type="spellEnd"/>
       <w:r>
         <w:rPr>
           <w:lang w:val="pt-BR"/>
@@ -1911,7 +2065,6 @@
           <w:rStyle w:val="VerbatimChar"/>
           <w:lang w:val="pt-BR"/>
         </w:rPr>
-        <w:lastRenderedPageBreak/>
         <w:t>├── está associada a uma Carteira</w:t>
       </w:r>
       <w:r>
@@ -2010,35 +2163,45 @@
           <w:bCs/>
           <w:lang w:val="pt-BR"/>
         </w:rPr>
-        <w:t>banco de dados SQLite</w:t>
-      </w:r>
-      <w:r>
-        <w:rPr>
-          <w:lang w:val="pt-BR"/>
-        </w:rPr>
-        <w:t>, utilizado para armazenar, consultar, modificar e remover informações relacionadas às carteiras simuladas, operações, configurações e alertas.</w:t>
-      </w:r>
-    </w:p>
-    <w:p>
-      <w:pPr>
-        <w:pStyle w:val="Corpodetexto"/>
-        <w:jc w:val="both"/>
-        <w:rPr>
-          <w:lang w:val="pt-BR"/>
-        </w:rPr>
-      </w:pPr>
-      <w:r>
-        <w:rPr>
-          <w:lang w:val="pt-BR"/>
-        </w:rPr>
-        <w:t xml:space="preserve">A segunda será a integração com um </w:t>
-      </w:r>
+        <w:t xml:space="preserve">banco de dados </w:t>
+      </w:r>
+      <w:proofErr w:type="spellStart"/>
       <w:r>
         <w:rPr>
           <w:b/>
           <w:bCs/>
           <w:lang w:val="pt-BR"/>
         </w:rPr>
+        <w:t>SQLite</w:t>
+      </w:r>
+      <w:proofErr w:type="spellEnd"/>
+      <w:r>
+        <w:rPr>
+          <w:lang w:val="pt-BR"/>
+        </w:rPr>
+        <w:t>, utilizado para armazenar, consultar, modificar e remover informações relacionadas às carteiras simuladas, operações, configurações e alertas.</w:t>
+      </w:r>
+    </w:p>
+    <w:p>
+      <w:pPr>
+        <w:pStyle w:val="Corpodetexto"/>
+        <w:jc w:val="both"/>
+        <w:rPr>
+          <w:lang w:val="pt-BR"/>
+        </w:rPr>
+      </w:pPr>
+      <w:r>
+        <w:rPr>
+          <w:lang w:val="pt-BR"/>
+        </w:rPr>
+        <w:t xml:space="preserve">A segunda será a integração com um </w:t>
+      </w:r>
+      <w:r>
+        <w:rPr>
+          <w:b/>
+          <w:bCs/>
+          <w:lang w:val="pt-BR"/>
+        </w:rPr>
         <w:t>serviço externo de informações financeiras</w:t>
       </w:r>
       <w:r>
@@ -2060,6 +2223,7 @@
         <w:rPr>
           <w:lang w:val="pt-BR"/>
         </w:rPr>
+        <w:lastRenderedPageBreak/>
         <w:t>Como integração adicional, pretende-se avaliar a utilização de um serviço de e-mail ou mensagens para envio automático de alertas de preço.</w:t>
       </w:r>
     </w:p>
@@ -2134,8 +2298,21 @@
         </w:numPr>
         <w:jc w:val="both"/>
       </w:pPr>
-      <w:r>
-        <w:t>evolução do patrimônio;</w:t>
+      <w:proofErr w:type="spellStart"/>
+      <w:r>
+        <w:t>evolução</w:t>
+      </w:r>
+      <w:proofErr w:type="spellEnd"/>
+      <w:r>
+        <w:t xml:space="preserve"> do </w:t>
+      </w:r>
+      <w:proofErr w:type="spellStart"/>
+      <w:r>
+        <w:t>patrimônio</w:t>
+      </w:r>
+      <w:proofErr w:type="spellEnd"/>
+      <w:r>
+        <w:t>;</w:t>
       </w:r>
     </w:p>
     <w:p>
@@ -2255,7 +2432,6 @@
         <w:rPr>
           <w:lang w:val="pt-BR"/>
         </w:rPr>
-        <w:lastRenderedPageBreak/>
         <w:t>A identidade visual será desenvolvida especificamente para o projeto, buscando oferecer uma interface moderna, organizada, intuitiva e coerente entre as diferentes áreas da aplicação.</w:t>
       </w:r>
     </w:p>
@@ -2390,6 +2566,7 @@
         <w:rPr>
           <w:lang w:val="pt-BR"/>
         </w:rPr>
+        <w:lastRenderedPageBreak/>
         <w:t xml:space="preserve">A organização geral prevista será semelhante </w:t>
       </w:r>
       <w:proofErr w:type="gramStart"/>
@@ -2479,9 +2656,9 @@
         <w:rPr>
           <w:lang w:val="pt-BR"/>
         </w:rPr>
-        <w:lastRenderedPageBreak/>
         <w:t xml:space="preserve">A navegação entre as páginas poderá ser implementada utilizando componentes como </w:t>
       </w:r>
+      <w:proofErr w:type="spellStart"/>
       <w:r>
         <w:rPr>
           <w:rStyle w:val="VerbatimChar"/>
@@ -2489,6 +2666,7 @@
         </w:rPr>
         <w:t>QStackedWidget</w:t>
       </w:r>
+      <w:proofErr w:type="spellEnd"/>
       <w:r>
         <w:rPr>
           <w:lang w:val="pt-BR"/>
@@ -2533,8 +2711,21 @@
         <w:pStyle w:val="Corpodetexto"/>
         <w:jc w:val="both"/>
       </w:pPr>
-      <w:r>
-        <w:t>Poderá apresentar:</w:t>
+      <w:proofErr w:type="spellStart"/>
+      <w:r>
+        <w:t>Poderá</w:t>
+      </w:r>
+      <w:proofErr w:type="spellEnd"/>
+      <w:r>
+        <w:t xml:space="preserve"> </w:t>
+      </w:r>
+      <w:proofErr w:type="spellStart"/>
+      <w:r>
+        <w:t>apresentar</w:t>
+      </w:r>
+      <w:proofErr w:type="spellEnd"/>
+      <w:r>
+        <w:t>:</w:t>
       </w:r>
     </w:p>
     <w:p>
@@ -2685,6 +2876,7 @@
         <w:rPr>
           <w:lang w:val="pt-BR"/>
         </w:rPr>
+        <w:lastRenderedPageBreak/>
         <w:t>Essa tela utilizará cartões de indicadores e gráficos para facilitar a interpretação das informações.</w:t>
       </w:r>
     </w:p>
@@ -2763,8 +2955,21 @@
         </w:numPr>
         <w:jc w:val="both"/>
       </w:pPr>
-      <w:r>
-        <w:t>cotação atual;</w:t>
+      <w:proofErr w:type="spellStart"/>
+      <w:r>
+        <w:t>cotação</w:t>
+      </w:r>
+      <w:proofErr w:type="spellEnd"/>
+      <w:r>
+        <w:t xml:space="preserve"> </w:t>
+      </w:r>
+      <w:proofErr w:type="spellStart"/>
+      <w:r>
+        <w:t>atual</w:t>
+      </w:r>
+      <w:proofErr w:type="spellEnd"/>
+      <w:r>
+        <w:t>;</w:t>
       </w:r>
     </w:p>
     <w:p>
@@ -2895,8 +3100,31 @@
         <w:jc w:val="both"/>
       </w:pPr>
       <w:r>
-        <w:lastRenderedPageBreak/>
-        <w:t>Nessa área será possível:</w:t>
+        <w:t xml:space="preserve">Nessa </w:t>
+      </w:r>
+      <w:proofErr w:type="spellStart"/>
+      <w:r>
+        <w:t>área</w:t>
+      </w:r>
+      <w:proofErr w:type="spellEnd"/>
+      <w:r>
+        <w:t xml:space="preserve"> </w:t>
+      </w:r>
+      <w:proofErr w:type="spellStart"/>
+      <w:r>
+        <w:t>será</w:t>
+      </w:r>
+      <w:proofErr w:type="spellEnd"/>
+      <w:r>
+        <w:t xml:space="preserve"> </w:t>
+      </w:r>
+      <w:proofErr w:type="spellStart"/>
+      <w:r>
+        <w:t>possível</w:t>
+      </w:r>
+      <w:proofErr w:type="spellEnd"/>
+      <w:r>
+        <w:t>:</w:t>
       </w:r>
     </w:p>
     <w:p>
@@ -3007,8 +3235,21 @@
         <w:pStyle w:val="Corpodetexto"/>
         <w:jc w:val="both"/>
       </w:pPr>
-      <w:r>
-        <w:t>Poderá conter:</w:t>
+      <w:proofErr w:type="spellStart"/>
+      <w:r>
+        <w:t>Poderá</w:t>
+      </w:r>
+      <w:proofErr w:type="spellEnd"/>
+      <w:r>
+        <w:t xml:space="preserve"> </w:t>
+      </w:r>
+      <w:proofErr w:type="spellStart"/>
+      <w:r>
+        <w:t>conter</w:t>
+      </w:r>
+      <w:proofErr w:type="spellEnd"/>
+      <w:r>
+        <w:t>:</w:t>
       </w:r>
     </w:p>
     <w:p>
@@ -3125,6 +3366,7 @@
         <w:jc w:val="both"/>
       </w:pPr>
       <w:r>
+        <w:lastRenderedPageBreak/>
         <w:t>distribuição percentual da carteira;</w:t>
       </w:r>
     </w:p>
@@ -3212,8 +3454,21 @@
         <w:pStyle w:val="Corpodetexto"/>
         <w:jc w:val="both"/>
       </w:pPr>
-      <w:r>
-        <w:t>Poderá incluir:</w:t>
+      <w:proofErr w:type="spellStart"/>
+      <w:r>
+        <w:t>Poderá</w:t>
+      </w:r>
+      <w:proofErr w:type="spellEnd"/>
+      <w:r>
+        <w:t xml:space="preserve"> </w:t>
+      </w:r>
+      <w:proofErr w:type="spellStart"/>
+      <w:r>
+        <w:t>incluir</w:t>
+      </w:r>
+      <w:proofErr w:type="spellEnd"/>
+      <w:r>
+        <w:t>:</w:t>
       </w:r>
     </w:p>
     <w:p>
@@ -3283,8 +3538,21 @@
         </w:numPr>
         <w:jc w:val="both"/>
       </w:pPr>
-      <w:r>
-        <w:t>estimativas de preço-teto;</w:t>
+      <w:proofErr w:type="spellStart"/>
+      <w:r>
+        <w:t>estimativas</w:t>
+      </w:r>
+      <w:proofErr w:type="spellEnd"/>
+      <w:r>
+        <w:t xml:space="preserve"> de </w:t>
+      </w:r>
+      <w:proofErr w:type="spellStart"/>
+      <w:r>
+        <w:t>preço-teto</w:t>
+      </w:r>
+      <w:proofErr w:type="spellEnd"/>
+      <w:r>
+        <w:t>;</w:t>
       </w:r>
     </w:p>
     <w:p>
@@ -3337,7 +3605,6 @@
         <w:rPr>
           <w:lang w:val="pt-BR"/>
         </w:rPr>
-        <w:lastRenderedPageBreak/>
         <w:t>Essa estrutura permitirá futuramente acrescentar novos métodos de avaliação sem modificar significativamente as demais partes da aplicação.</w:t>
       </w:r>
     </w:p>
@@ -3546,6 +3813,7 @@
         <w:rPr>
           <w:lang w:val="pt-BR"/>
         </w:rPr>
+        <w:lastRenderedPageBreak/>
         <w:t>Os alertas poderão inicialmente ser exibidos dentro da própria aplicação e, posteriormente, poderão ser associados ao envio de notificações por e-mail ou outro serviço externo.</w:t>
       </w:r>
     </w:p>
@@ -3586,8 +3854,21 @@
         <w:pStyle w:val="Corpodetexto"/>
         <w:jc w:val="both"/>
       </w:pPr>
-      <w:r>
-        <w:t>Poderá conter:</w:t>
+      <w:proofErr w:type="spellStart"/>
+      <w:r>
+        <w:t>Poderá</w:t>
+      </w:r>
+      <w:proofErr w:type="spellEnd"/>
+      <w:r>
+        <w:t xml:space="preserve"> </w:t>
+      </w:r>
+      <w:proofErr w:type="spellStart"/>
+      <w:r>
+        <w:t>conter</w:t>
+      </w:r>
+      <w:proofErr w:type="spellEnd"/>
+      <w:r>
+        <w:t>:</w:t>
       </w:r>
     </w:p>
     <w:p>
@@ -3736,7 +4017,6 @@
         <w:rPr>
           <w:lang w:val="pt-BR"/>
         </w:rPr>
-        <w:lastRenderedPageBreak/>
         <w:t>8.9. Assistente baseado em Inteligência Artificial</w:t>
       </w:r>
     </w:p>
@@ -3779,8 +4059,29 @@
         </w:numPr>
         <w:jc w:val="both"/>
       </w:pPr>
-      <w:r>
-        <w:t>explicações sobre indicadores;</w:t>
+      <w:proofErr w:type="spellStart"/>
+      <w:r>
+        <w:t>explicações</w:t>
+      </w:r>
+      <w:proofErr w:type="spellEnd"/>
+      <w:r>
+        <w:t xml:space="preserve"> </w:t>
+      </w:r>
+      <w:proofErr w:type="spellStart"/>
+      <w:r>
+        <w:t>sobre</w:t>
+      </w:r>
+      <w:proofErr w:type="spellEnd"/>
+      <w:r>
+        <w:t xml:space="preserve"> </w:t>
+      </w:r>
+      <w:proofErr w:type="spellStart"/>
+      <w:r>
+        <w:t>indicadores</w:t>
+      </w:r>
+      <w:proofErr w:type="spellEnd"/>
+      <w:r>
+        <w:t>;</w:t>
       </w:r>
     </w:p>
     <w:p>
@@ -3824,8 +4125,21 @@
         </w:numPr>
         <w:jc w:val="both"/>
       </w:pPr>
-      <w:r>
-        <w:t>análises descritivas;</w:t>
+      <w:proofErr w:type="spellStart"/>
+      <w:r>
+        <w:t>análises</w:t>
+      </w:r>
+      <w:proofErr w:type="spellEnd"/>
+      <w:r>
+        <w:t xml:space="preserve"> </w:t>
+      </w:r>
+      <w:proofErr w:type="spellStart"/>
+      <w:r>
+        <w:t>descritivas</w:t>
+      </w:r>
+      <w:proofErr w:type="spellEnd"/>
+      <w:r>
+        <w:t>;</w:t>
       </w:r>
     </w:p>
     <w:p>
@@ -3903,8 +4217,29 @@
         </w:numPr>
         <w:jc w:val="both"/>
       </w:pPr>
-      <w:r>
-        <w:t>configurações dos serviços externos;</w:t>
+      <w:proofErr w:type="spellStart"/>
+      <w:r>
+        <w:t>configurações</w:t>
+      </w:r>
+      <w:proofErr w:type="spellEnd"/>
+      <w:r>
+        <w:t xml:space="preserve"> dos </w:t>
+      </w:r>
+      <w:proofErr w:type="spellStart"/>
+      <w:r>
+        <w:t>serviços</w:t>
+      </w:r>
+      <w:proofErr w:type="spellEnd"/>
+      <w:r>
+        <w:t xml:space="preserve"> </w:t>
+      </w:r>
+      <w:proofErr w:type="spellStart"/>
+      <w:r>
+        <w:t>externos</w:t>
+      </w:r>
+      <w:proofErr w:type="spellEnd"/>
+      <w:r>
+        <w:t>;</w:t>
       </w:r>
     </w:p>
     <w:p>
@@ -3943,6 +4278,7 @@
         <w:jc w:val="both"/>
       </w:pPr>
       <w:r>
+        <w:lastRenderedPageBreak/>
         <w:t>opções relacionadas às notificações;</w:t>
       </w:r>
     </w:p>
@@ -4049,7 +4385,6 @@
           <w:noProof/>
           <w:lang w:val="pt-BR"/>
         </w:rPr>
-        <w:lastRenderedPageBreak/>
         <w:drawing>
           <wp:inline distT="0" distB="0" distL="0" distR="0" wp14:anchorId="4B71802F" wp14:editId="66547BE3">
             <wp:extent cx="5430301" cy="2715151"/>
@@ -4196,8 +4531,13 @@
         </w:numPr>
         <w:jc w:val="both"/>
       </w:pPr>
-      <w:r>
-        <w:t xml:space="preserve">escolher </w:t>
+      <w:proofErr w:type="spellStart"/>
+      <w:r>
+        <w:t>escolher</w:t>
+      </w:r>
+      <w:proofErr w:type="spellEnd"/>
+      <w:r>
+        <w:t xml:space="preserve"> </w:t>
       </w:r>
       <w:proofErr w:type="gramStart"/>
       <w:r>
@@ -4205,7 +4545,15 @@
       </w:r>
       <w:proofErr w:type="gramEnd"/>
       <w:r>
-        <w:t xml:space="preserve"> identidade visual;</w:t>
+        <w:t xml:space="preserve"> </w:t>
+      </w:r>
+      <w:proofErr w:type="spellStart"/>
+      <w:r>
+        <w:t>identidade</w:t>
+      </w:r>
+      <w:proofErr w:type="spellEnd"/>
+      <w:r>
+        <w:t xml:space="preserve"> visual;</w:t>
       </w:r>
     </w:p>
     <w:p>
@@ -4299,6 +4647,7 @@
           <w:bCs/>
           <w:lang w:val="pt-BR"/>
         </w:rPr>
+        <w:lastRenderedPageBreak/>
         <w:t>Resultado esperado:</w:t>
       </w:r>
       <w:r>
@@ -4351,15 +4700,22 @@
         </w:numPr>
         <w:jc w:val="both"/>
       </w:pPr>
-      <w:r>
-        <w:t xml:space="preserve">desenvolver a </w:t>
-      </w:r>
+      <w:proofErr w:type="spellStart"/>
+      <w:r>
+        <w:t>desenvolver</w:t>
+      </w:r>
+      <w:proofErr w:type="spellEnd"/>
+      <w:r>
+        <w:t xml:space="preserve"> a </w:t>
+      </w:r>
+      <w:proofErr w:type="spellStart"/>
       <w:r>
         <w:rPr>
           <w:rStyle w:val="VerbatimChar"/>
         </w:rPr>
         <w:t>MainWindow</w:t>
       </w:r>
+      <w:proofErr w:type="spellEnd"/>
       <w:r>
         <w:t>;</w:t>
       </w:r>
@@ -4465,6 +4821,7 @@
         </w:rPr>
         <w:t xml:space="preserve">implementar navegação através de </w:t>
       </w:r>
+      <w:proofErr w:type="spellStart"/>
       <w:r>
         <w:rPr>
           <w:rStyle w:val="VerbatimChar"/>
@@ -4472,6 +4829,7 @@
         </w:rPr>
         <w:t>QStackedWidget</w:t>
       </w:r>
+      <w:proofErr w:type="spellEnd"/>
       <w:r>
         <w:rPr>
           <w:lang w:val="pt-BR"/>
@@ -4493,7 +4851,6 @@
           <w:bCs/>
           <w:lang w:val="pt-BR"/>
         </w:rPr>
-        <w:lastRenderedPageBreak/>
         <w:t>Resultado esperado:</w:t>
       </w:r>
       <w:r>
@@ -4546,8 +4903,13 @@
         </w:numPr>
         <w:jc w:val="both"/>
       </w:pPr>
-      <w:r>
-        <w:t>estruturar Dashboard;</w:t>
+      <w:proofErr w:type="spellStart"/>
+      <w:r>
+        <w:t>estruturar</w:t>
+      </w:r>
+      <w:proofErr w:type="spellEnd"/>
+      <w:r>
+        <w:t xml:space="preserve"> Dashboard;</w:t>
       </w:r>
     </w:p>
     <w:p>
@@ -4705,225 +5067,280 @@
         <w:pStyle w:val="FirstParagraph"/>
         <w:jc w:val="both"/>
       </w:pPr>
+      <w:proofErr w:type="spellStart"/>
       <w:r>
         <w:rPr>
           <w:b/>
           <w:bCs/>
         </w:rPr>
-        <w:t>Objetivos:</w:t>
-      </w:r>
-    </w:p>
-    <w:p>
-      <w:pPr>
-        <w:pStyle w:val="Compact"/>
-        <w:numPr>
-          <w:ilvl w:val="0"/>
-          <w:numId w:val="17"/>
-        </w:numPr>
-        <w:jc w:val="both"/>
-        <w:rPr>
-          <w:lang w:val="pt-BR"/>
-        </w:rPr>
-      </w:pPr>
-      <w:r>
-        <w:rPr>
-          <w:lang w:val="pt-BR"/>
-        </w:rPr>
-        <w:t>implementar classes principais do domínio;</w:t>
-      </w:r>
-    </w:p>
-    <w:p>
-      <w:pPr>
-        <w:pStyle w:val="Compact"/>
-        <w:numPr>
-          <w:ilvl w:val="0"/>
-          <w:numId w:val="17"/>
-        </w:numPr>
-        <w:jc w:val="both"/>
-        <w:rPr>
-          <w:lang w:val="pt-BR"/>
-        </w:rPr>
-      </w:pPr>
-      <w:r>
-        <w:rPr>
-          <w:lang w:val="pt-BR"/>
-        </w:rPr>
-        <w:t xml:space="preserve">implementar </w:t>
-      </w:r>
-      <w:r>
-        <w:rPr>
-          <w:rStyle w:val="VerbatimChar"/>
-          <w:lang w:val="pt-BR"/>
-        </w:rPr>
-        <w:t>Ativo</w:t>
-      </w:r>
-      <w:r>
-        <w:rPr>
-          <w:lang w:val="pt-BR"/>
-        </w:rPr>
-        <w:t xml:space="preserve">, </w:t>
-      </w:r>
-      <w:r>
-        <w:rPr>
-          <w:rStyle w:val="VerbatimChar"/>
-          <w:lang w:val="pt-BR"/>
-        </w:rPr>
-        <w:t>Carteira</w:t>
-      </w:r>
-      <w:r>
-        <w:rPr>
-          <w:lang w:val="pt-BR"/>
-        </w:rPr>
-        <w:t xml:space="preserve">, </w:t>
-      </w:r>
-      <w:r>
-        <w:rPr>
-          <w:rStyle w:val="VerbatimChar"/>
-          <w:lang w:val="pt-BR"/>
-        </w:rPr>
-        <w:t>Posicao</w:t>
-      </w:r>
-      <w:r>
-        <w:rPr>
-          <w:lang w:val="pt-BR"/>
-        </w:rPr>
-        <w:t xml:space="preserve">, </w:t>
-      </w:r>
-      <w:r>
-        <w:rPr>
-          <w:rStyle w:val="VerbatimChar"/>
-          <w:lang w:val="pt-BR"/>
-        </w:rPr>
-        <w:t>Transacao</w:t>
-      </w:r>
-      <w:r>
-        <w:rPr>
-          <w:lang w:val="pt-BR"/>
-        </w:rPr>
-        <w:t xml:space="preserve"> e </w:t>
-      </w:r>
-      <w:r>
-        <w:rPr>
-          <w:rStyle w:val="VerbatimChar"/>
-          <w:lang w:val="pt-BR"/>
-        </w:rPr>
-        <w:t>AlertaPreco</w:t>
-      </w:r>
-      <w:r>
-        <w:rPr>
-          <w:lang w:val="pt-BR"/>
-        </w:rPr>
-        <w:t>;</w:t>
-      </w:r>
-    </w:p>
-    <w:p>
-      <w:pPr>
-        <w:pStyle w:val="Compact"/>
-        <w:numPr>
-          <w:ilvl w:val="0"/>
-          <w:numId w:val="17"/>
-        </w:numPr>
-        <w:jc w:val="both"/>
-      </w:pPr>
-      <w:r>
-        <w:t>implementar relacionamentos entre objetos;</w:t>
-      </w:r>
-    </w:p>
-    <w:p>
-      <w:pPr>
-        <w:pStyle w:val="Compact"/>
-        <w:numPr>
-          <w:ilvl w:val="0"/>
-          <w:numId w:val="17"/>
-        </w:numPr>
-        <w:jc w:val="both"/>
-        <w:rPr>
-          <w:lang w:val="pt-BR"/>
-        </w:rPr>
-      </w:pPr>
-      <w:r>
-        <w:rPr>
-          <w:lang w:val="pt-BR"/>
-        </w:rPr>
-        <w:t>estabelecer separação entre interface, regras de negócio e persistência;</w:t>
-      </w:r>
-    </w:p>
-    <w:p>
-      <w:pPr>
-        <w:pStyle w:val="Compact"/>
-        <w:numPr>
-          <w:ilvl w:val="0"/>
-          <w:numId w:val="17"/>
-        </w:numPr>
-        <w:jc w:val="both"/>
-      </w:pPr>
-      <w:r>
-        <w:t>configurar banco SQLite;</w:t>
-      </w:r>
-    </w:p>
-    <w:p>
-      <w:pPr>
-        <w:pStyle w:val="Compact"/>
-        <w:numPr>
-          <w:ilvl w:val="0"/>
-          <w:numId w:val="17"/>
-        </w:numPr>
-        <w:jc w:val="both"/>
-        <w:rPr>
-          <w:lang w:val="pt-BR"/>
-        </w:rPr>
-      </w:pPr>
-      <w:r>
-        <w:rPr>
-          <w:lang w:val="pt-BR"/>
-        </w:rPr>
-        <w:t>implementar camada de acesso aos dados;</w:t>
-      </w:r>
-    </w:p>
-    <w:p>
-      <w:pPr>
-        <w:pStyle w:val="Compact"/>
-        <w:numPr>
-          <w:ilvl w:val="0"/>
-          <w:numId w:val="17"/>
-        </w:numPr>
-        <w:jc w:val="both"/>
-      </w:pPr>
-      <w:r>
-        <w:t>criar operações CRUD;</w:t>
-      </w:r>
-    </w:p>
-    <w:p>
-      <w:pPr>
-        <w:pStyle w:val="Compact"/>
-        <w:numPr>
-          <w:ilvl w:val="0"/>
-          <w:numId w:val="17"/>
-        </w:numPr>
-        <w:jc w:val="both"/>
-        <w:rPr>
-          <w:lang w:val="pt-BR"/>
-        </w:rPr>
-      </w:pPr>
-      <w:r>
-        <w:rPr>
-          <w:lang w:val="pt-BR"/>
-        </w:rPr>
-        <w:t>integrar criação, edição e exclusão de carteiras à interface.</w:t>
-      </w:r>
-    </w:p>
-    <w:p>
-      <w:pPr>
-        <w:pStyle w:val="FirstParagraph"/>
-        <w:jc w:val="both"/>
-        <w:rPr>
-          <w:lang w:val="pt-BR"/>
-        </w:rPr>
-      </w:pPr>
+        <w:t>Objetivos</w:t>
+      </w:r>
+      <w:proofErr w:type="spellEnd"/>
       <w:r>
         <w:rPr>
           <w:b/>
           <w:bCs/>
+        </w:rPr>
+        <w:t>:</w:t>
+      </w:r>
+    </w:p>
+    <w:p>
+      <w:pPr>
+        <w:pStyle w:val="Compact"/>
+        <w:numPr>
+          <w:ilvl w:val="0"/>
+          <w:numId w:val="17"/>
+        </w:numPr>
+        <w:jc w:val="both"/>
+        <w:rPr>
+          <w:lang w:val="pt-BR"/>
+        </w:rPr>
+      </w:pPr>
+      <w:r>
+        <w:rPr>
+          <w:lang w:val="pt-BR"/>
+        </w:rPr>
+        <w:t>implementar classes principais do domínio;</w:t>
+      </w:r>
+    </w:p>
+    <w:p>
+      <w:pPr>
+        <w:pStyle w:val="Compact"/>
+        <w:numPr>
+          <w:ilvl w:val="0"/>
+          <w:numId w:val="17"/>
+        </w:numPr>
+        <w:jc w:val="both"/>
+        <w:rPr>
+          <w:lang w:val="pt-BR"/>
+        </w:rPr>
+      </w:pPr>
+      <w:r>
+        <w:rPr>
+          <w:lang w:val="pt-BR"/>
+        </w:rPr>
+        <w:t xml:space="preserve">implementar </w:t>
+      </w:r>
+      <w:r>
+        <w:rPr>
+          <w:rStyle w:val="VerbatimChar"/>
+          <w:lang w:val="pt-BR"/>
+        </w:rPr>
+        <w:t>Ativo</w:t>
+      </w:r>
+      <w:r>
+        <w:rPr>
+          <w:lang w:val="pt-BR"/>
+        </w:rPr>
+        <w:t xml:space="preserve">, </w:t>
+      </w:r>
+      <w:r>
+        <w:rPr>
+          <w:rStyle w:val="VerbatimChar"/>
+          <w:lang w:val="pt-BR"/>
+        </w:rPr>
+        <w:t>Carteira</w:t>
+      </w:r>
+      <w:r>
+        <w:rPr>
+          <w:lang w:val="pt-BR"/>
+        </w:rPr>
+        <w:t xml:space="preserve">, </w:t>
+      </w:r>
+      <w:proofErr w:type="spellStart"/>
+      <w:r>
+        <w:rPr>
+          <w:rStyle w:val="VerbatimChar"/>
+          <w:lang w:val="pt-BR"/>
+        </w:rPr>
+        <w:t>Posicao</w:t>
+      </w:r>
+      <w:proofErr w:type="spellEnd"/>
+      <w:r>
+        <w:rPr>
+          <w:lang w:val="pt-BR"/>
+        </w:rPr>
+        <w:t xml:space="preserve">, </w:t>
+      </w:r>
+      <w:proofErr w:type="spellStart"/>
+      <w:r>
+        <w:rPr>
+          <w:rStyle w:val="VerbatimChar"/>
+          <w:lang w:val="pt-BR"/>
+        </w:rPr>
+        <w:t>Transacao</w:t>
+      </w:r>
+      <w:proofErr w:type="spellEnd"/>
+      <w:r>
+        <w:rPr>
+          <w:lang w:val="pt-BR"/>
+        </w:rPr>
+        <w:t xml:space="preserve"> e </w:t>
+      </w:r>
+      <w:proofErr w:type="spellStart"/>
+      <w:r>
+        <w:rPr>
+          <w:rStyle w:val="VerbatimChar"/>
+          <w:lang w:val="pt-BR"/>
+        </w:rPr>
+        <w:t>AlertaPreco</w:t>
+      </w:r>
+      <w:proofErr w:type="spellEnd"/>
+      <w:r>
+        <w:rPr>
+          <w:lang w:val="pt-BR"/>
+        </w:rPr>
+        <w:t>;</w:t>
+      </w:r>
+    </w:p>
+    <w:p>
+      <w:pPr>
+        <w:pStyle w:val="Compact"/>
+        <w:numPr>
+          <w:ilvl w:val="0"/>
+          <w:numId w:val="17"/>
+        </w:numPr>
+        <w:jc w:val="both"/>
+      </w:pPr>
+      <w:proofErr w:type="spellStart"/>
+      <w:r>
+        <w:t>implementar</w:t>
+      </w:r>
+      <w:proofErr w:type="spellEnd"/>
+      <w:r>
+        <w:t xml:space="preserve"> </w:t>
+      </w:r>
+      <w:proofErr w:type="spellStart"/>
+      <w:r>
+        <w:t>relacionamentos</w:t>
+      </w:r>
+      <w:proofErr w:type="spellEnd"/>
+      <w:r>
+        <w:t xml:space="preserve"> entre </w:t>
+      </w:r>
+      <w:proofErr w:type="spellStart"/>
+      <w:r>
+        <w:t>objetos</w:t>
+      </w:r>
+      <w:proofErr w:type="spellEnd"/>
+      <w:r>
+        <w:t>;</w:t>
+      </w:r>
+    </w:p>
+    <w:p>
+      <w:pPr>
+        <w:pStyle w:val="Compact"/>
+        <w:numPr>
+          <w:ilvl w:val="0"/>
+          <w:numId w:val="17"/>
+        </w:numPr>
+        <w:jc w:val="both"/>
+        <w:rPr>
+          <w:lang w:val="pt-BR"/>
+        </w:rPr>
+      </w:pPr>
+      <w:r>
+        <w:rPr>
+          <w:lang w:val="pt-BR"/>
+        </w:rPr>
+        <w:t>estabelecer separação entre interface, regras de negócio e persistência;</w:t>
+      </w:r>
+    </w:p>
+    <w:p>
+      <w:pPr>
+        <w:pStyle w:val="Compact"/>
+        <w:numPr>
+          <w:ilvl w:val="0"/>
+          <w:numId w:val="17"/>
+        </w:numPr>
+        <w:jc w:val="both"/>
+      </w:pPr>
+      <w:proofErr w:type="spellStart"/>
+      <w:r>
+        <w:t>configurar</w:t>
+      </w:r>
+      <w:proofErr w:type="spellEnd"/>
+      <w:r>
+        <w:t xml:space="preserve"> banco SQLite;</w:t>
+      </w:r>
+    </w:p>
+    <w:p>
+      <w:pPr>
+        <w:pStyle w:val="Compact"/>
+        <w:numPr>
+          <w:ilvl w:val="0"/>
+          <w:numId w:val="17"/>
+        </w:numPr>
+        <w:jc w:val="both"/>
+        <w:rPr>
+          <w:lang w:val="pt-BR"/>
+        </w:rPr>
+      </w:pPr>
+      <w:r>
+        <w:rPr>
+          <w:lang w:val="pt-BR"/>
+        </w:rPr>
+        <w:t>implementar camada de acesso aos dados;</w:t>
+      </w:r>
+    </w:p>
+    <w:p>
+      <w:pPr>
+        <w:pStyle w:val="Compact"/>
+        <w:numPr>
+          <w:ilvl w:val="0"/>
+          <w:numId w:val="17"/>
+        </w:numPr>
+        <w:jc w:val="both"/>
+      </w:pPr>
+      <w:proofErr w:type="spellStart"/>
+      <w:r>
+        <w:t>criar</w:t>
+      </w:r>
+      <w:proofErr w:type="spellEnd"/>
+      <w:r>
+        <w:t xml:space="preserve"> </w:t>
+      </w:r>
+      <w:proofErr w:type="spellStart"/>
+      <w:r>
+        <w:t>operações</w:t>
+      </w:r>
+      <w:proofErr w:type="spellEnd"/>
+      <w:r>
+        <w:t xml:space="preserve"> CRUD;</w:t>
+      </w:r>
+    </w:p>
+    <w:p>
+      <w:pPr>
+        <w:pStyle w:val="Compact"/>
+        <w:numPr>
+          <w:ilvl w:val="0"/>
+          <w:numId w:val="17"/>
+        </w:numPr>
+        <w:jc w:val="both"/>
+        <w:rPr>
+          <w:lang w:val="pt-BR"/>
+        </w:rPr>
+      </w:pPr>
+      <w:r>
+        <w:rPr>
+          <w:lang w:val="pt-BR"/>
+        </w:rPr>
+        <w:lastRenderedPageBreak/>
+        <w:t>integrar criação, edição e exclusão de carteiras à interface.</w:t>
+      </w:r>
+    </w:p>
+    <w:p>
+      <w:pPr>
+        <w:pStyle w:val="FirstParagraph"/>
+        <w:jc w:val="both"/>
+        <w:rPr>
+          <w:lang w:val="pt-BR"/>
+        </w:rPr>
+      </w:pPr>
+      <w:r>
+        <w:rPr>
+          <w:b/>
+          <w:bCs/>
           <w:lang w:val="pt-BR"/>
         </w:rPr>
         <w:t>Resultado esperado:</w:t>
@@ -4957,441 +5374,495 @@
         <w:pStyle w:val="FirstParagraph"/>
         <w:jc w:val="both"/>
       </w:pPr>
+      <w:proofErr w:type="spellStart"/>
       <w:r>
         <w:rPr>
           <w:b/>
           <w:bCs/>
         </w:rPr>
-        <w:t>Objetivos:</w:t>
-      </w:r>
-    </w:p>
-    <w:p>
-      <w:pPr>
-        <w:pStyle w:val="Compact"/>
-        <w:numPr>
-          <w:ilvl w:val="0"/>
-          <w:numId w:val="18"/>
-        </w:numPr>
-        <w:jc w:val="both"/>
-        <w:rPr>
-          <w:lang w:val="pt-BR"/>
-        </w:rPr>
-      </w:pPr>
-      <w:r>
-        <w:rPr>
-          <w:lang w:val="pt-BR"/>
-        </w:rPr>
-        <w:t>integrar o serviço externo de informações financeiras;</w:t>
-      </w:r>
-    </w:p>
-    <w:p>
-      <w:pPr>
-        <w:pStyle w:val="Compact"/>
-        <w:numPr>
-          <w:ilvl w:val="0"/>
-          <w:numId w:val="18"/>
-        </w:numPr>
-        <w:jc w:val="both"/>
-      </w:pPr>
-      <w:r>
-        <w:t>implementar pesquisa de ativos;</w:t>
-      </w:r>
-    </w:p>
-    <w:p>
-      <w:pPr>
-        <w:pStyle w:val="Compact"/>
-        <w:numPr>
-          <w:ilvl w:val="0"/>
-          <w:numId w:val="18"/>
-        </w:numPr>
-        <w:jc w:val="both"/>
-      </w:pPr>
-      <w:r>
-        <w:t>obter cotações reais;</w:t>
-      </w:r>
-    </w:p>
-    <w:p>
-      <w:pPr>
-        <w:pStyle w:val="Compact"/>
-        <w:numPr>
-          <w:ilvl w:val="0"/>
-          <w:numId w:val="18"/>
-        </w:numPr>
-        <w:jc w:val="both"/>
-        <w:rPr>
-          <w:lang w:val="pt-BR"/>
-        </w:rPr>
-      </w:pPr>
-      <w:r>
-        <w:rPr>
-          <w:lang w:val="pt-BR"/>
-        </w:rPr>
-        <w:t>apresentar informações recebidas na interface;</w:t>
-      </w:r>
-    </w:p>
-    <w:p>
-      <w:pPr>
-        <w:pStyle w:val="Compact"/>
-        <w:numPr>
-          <w:ilvl w:val="0"/>
-          <w:numId w:val="18"/>
-        </w:numPr>
-        <w:jc w:val="both"/>
-      </w:pPr>
-      <w:r>
-        <w:t>tratar falhas de conexão;</w:t>
-      </w:r>
-    </w:p>
-    <w:p>
-      <w:pPr>
-        <w:pStyle w:val="Compact"/>
-        <w:numPr>
-          <w:ilvl w:val="0"/>
-          <w:numId w:val="18"/>
-        </w:numPr>
-        <w:jc w:val="both"/>
-      </w:pPr>
-      <w:r>
-        <w:t>tratar ativos inexistentes;</w:t>
-      </w:r>
-    </w:p>
-    <w:p>
-      <w:pPr>
-        <w:pStyle w:val="Compact"/>
-        <w:numPr>
-          <w:ilvl w:val="0"/>
-          <w:numId w:val="18"/>
-        </w:numPr>
-        <w:jc w:val="both"/>
-        <w:rPr>
-          <w:lang w:val="pt-BR"/>
-        </w:rPr>
-      </w:pPr>
-      <w:r>
-        <w:rPr>
-          <w:lang w:val="pt-BR"/>
-        </w:rPr>
-        <w:lastRenderedPageBreak/>
-        <w:t>integrar pelo menos um fluxo completo entre interface, serviços, objetos e banco de dados;</w:t>
-      </w:r>
-    </w:p>
-    <w:p>
-      <w:pPr>
-        <w:pStyle w:val="Compact"/>
-        <w:numPr>
-          <w:ilvl w:val="0"/>
-          <w:numId w:val="18"/>
-        </w:numPr>
-        <w:jc w:val="both"/>
-        <w:rPr>
-          <w:lang w:val="pt-BR"/>
-        </w:rPr>
-      </w:pPr>
-      <w:r>
-        <w:rPr>
-          <w:lang w:val="pt-BR"/>
-        </w:rPr>
-        <w:t>revisar arquitetura e principais classes;</w:t>
-      </w:r>
-    </w:p>
-    <w:p>
-      <w:pPr>
-        <w:pStyle w:val="Compact"/>
-        <w:numPr>
-          <w:ilvl w:val="0"/>
-          <w:numId w:val="18"/>
-        </w:numPr>
-        <w:jc w:val="both"/>
-        <w:rPr>
-          <w:lang w:val="pt-BR"/>
-        </w:rPr>
-      </w:pPr>
-      <w:r>
-        <w:rPr>
-          <w:lang w:val="pt-BR"/>
-        </w:rPr>
-        <w:t>preparar demonstração da versão parcial.</w:t>
-      </w:r>
-    </w:p>
-    <w:p>
-      <w:pPr>
-        <w:pStyle w:val="FirstParagraph"/>
-        <w:jc w:val="both"/>
-        <w:rPr>
-          <w:lang w:val="pt-BR"/>
-        </w:rPr>
-      </w:pPr>
-      <w:r>
-        <w:rPr>
-          <w:lang w:val="pt-BR"/>
-        </w:rPr>
-        <w:t>Até essa etapa, pretende-se possuir pelo menos os seguintes fluxos funcionais:</w:t>
-      </w:r>
-    </w:p>
-    <w:p>
-      <w:pPr>
-        <w:pStyle w:val="SourceCode"/>
-        <w:rPr>
-          <w:lang w:val="pt-BR"/>
-        </w:rPr>
-      </w:pPr>
-      <w:r>
-        <w:rPr>
-          <w:rStyle w:val="VerbatimChar"/>
-          <w:lang w:val="pt-BR"/>
-        </w:rPr>
-        <w:t>Interface</w:t>
-      </w:r>
-      <w:r>
-        <w:rPr>
-          <w:lang w:val="pt-BR"/>
-        </w:rPr>
-        <w:br/>
-      </w:r>
-      <w:r>
-        <w:rPr>
-          <w:rStyle w:val="VerbatimChar"/>
-          <w:lang w:val="pt-BR"/>
-        </w:rPr>
-        <w:t xml:space="preserve">   ↓</w:t>
-      </w:r>
-      <w:r>
-        <w:rPr>
-          <w:lang w:val="pt-BR"/>
-        </w:rPr>
-        <w:br/>
-      </w:r>
-      <w:r>
-        <w:rPr>
-          <w:rStyle w:val="VerbatimChar"/>
-          <w:lang w:val="pt-BR"/>
-        </w:rPr>
-        <w:t>Criar carteira</w:t>
-      </w:r>
-      <w:r>
-        <w:rPr>
-          <w:lang w:val="pt-BR"/>
-        </w:rPr>
-        <w:br/>
-      </w:r>
-      <w:r>
-        <w:rPr>
-          <w:rStyle w:val="VerbatimChar"/>
-          <w:lang w:val="pt-BR"/>
-        </w:rPr>
-        <w:t xml:space="preserve">   ↓</w:t>
-      </w:r>
-      <w:r>
-        <w:rPr>
-          <w:lang w:val="pt-BR"/>
-        </w:rPr>
-        <w:br/>
-      </w:r>
-      <w:r>
-        <w:rPr>
-          <w:rStyle w:val="VerbatimChar"/>
-          <w:lang w:val="pt-BR"/>
-        </w:rPr>
-        <w:t>Objeto Carteira</w:t>
-      </w:r>
-      <w:r>
-        <w:rPr>
-          <w:lang w:val="pt-BR"/>
-        </w:rPr>
-        <w:br/>
-      </w:r>
-      <w:r>
-        <w:rPr>
-          <w:rStyle w:val="VerbatimChar"/>
-          <w:lang w:val="pt-BR"/>
-        </w:rPr>
-        <w:t xml:space="preserve">   ↓</w:t>
-      </w:r>
-      <w:r>
-        <w:rPr>
-          <w:lang w:val="pt-BR"/>
-        </w:rPr>
-        <w:br/>
-      </w:r>
-      <w:r>
-        <w:rPr>
-          <w:rStyle w:val="VerbatimChar"/>
-          <w:lang w:val="pt-BR"/>
-        </w:rPr>
-        <w:t>Repository</w:t>
-      </w:r>
-      <w:r>
-        <w:rPr>
-          <w:lang w:val="pt-BR"/>
-        </w:rPr>
-        <w:br/>
-      </w:r>
-      <w:r>
-        <w:rPr>
-          <w:rStyle w:val="VerbatimChar"/>
-          <w:lang w:val="pt-BR"/>
-        </w:rPr>
-        <w:t xml:space="preserve">   ↓</w:t>
-      </w:r>
-      <w:r>
-        <w:rPr>
-          <w:lang w:val="pt-BR"/>
-        </w:rPr>
-        <w:br/>
-      </w:r>
-      <w:r>
-        <w:rPr>
-          <w:rStyle w:val="VerbatimChar"/>
-          <w:lang w:val="pt-BR"/>
-        </w:rPr>
-        <w:t>SQLite</w:t>
-      </w:r>
-    </w:p>
-    <w:p>
-      <w:pPr>
-        <w:pStyle w:val="FirstParagraph"/>
-        <w:rPr>
-          <w:lang w:val="pt-BR"/>
-        </w:rPr>
-      </w:pPr>
-      <w:r>
-        <w:rPr>
-          <w:lang w:val="pt-BR"/>
-        </w:rPr>
-        <w:t>e:</w:t>
-      </w:r>
-    </w:p>
-    <w:p>
-      <w:pPr>
-        <w:pStyle w:val="SourceCode"/>
-        <w:rPr>
-          <w:lang w:val="pt-BR"/>
-        </w:rPr>
-      </w:pPr>
-      <w:r>
-        <w:rPr>
-          <w:rStyle w:val="VerbatimChar"/>
-          <w:lang w:val="pt-BR"/>
-        </w:rPr>
-        <w:t>Pesquisar ativo</w:t>
-      </w:r>
-      <w:r>
-        <w:rPr>
-          <w:lang w:val="pt-BR"/>
-        </w:rPr>
-        <w:br/>
-      </w:r>
-      <w:r>
-        <w:rPr>
-          <w:rStyle w:val="VerbatimChar"/>
-          <w:lang w:val="pt-BR"/>
-        </w:rPr>
-        <w:t xml:space="preserve">      ↓</w:t>
-      </w:r>
-      <w:r>
-        <w:rPr>
-          <w:lang w:val="pt-BR"/>
-        </w:rPr>
-        <w:br/>
-      </w:r>
-      <w:r>
-        <w:rPr>
-          <w:rStyle w:val="VerbatimChar"/>
-          <w:lang w:val="pt-BR"/>
-        </w:rPr>
-        <w:t>Serviço de mercado</w:t>
-      </w:r>
-      <w:r>
-        <w:rPr>
-          <w:lang w:val="pt-BR"/>
-        </w:rPr>
-        <w:br/>
-      </w:r>
-      <w:r>
-        <w:rPr>
-          <w:rStyle w:val="VerbatimChar"/>
-          <w:lang w:val="pt-BR"/>
-        </w:rPr>
-        <w:t xml:space="preserve">      ↓</w:t>
-      </w:r>
-      <w:r>
-        <w:rPr>
-          <w:lang w:val="pt-BR"/>
-        </w:rPr>
-        <w:br/>
-      </w:r>
-      <w:r>
-        <w:rPr>
-          <w:rStyle w:val="VerbatimChar"/>
-          <w:lang w:val="pt-BR"/>
-        </w:rPr>
-        <w:t>API externa</w:t>
-      </w:r>
-      <w:r>
-        <w:rPr>
-          <w:lang w:val="pt-BR"/>
-        </w:rPr>
-        <w:br/>
-      </w:r>
-      <w:r>
-        <w:rPr>
-          <w:rStyle w:val="VerbatimChar"/>
-          <w:lang w:val="pt-BR"/>
-        </w:rPr>
-        <w:t xml:space="preserve">      ↓</w:t>
-      </w:r>
-      <w:r>
-        <w:rPr>
-          <w:lang w:val="pt-BR"/>
-        </w:rPr>
-        <w:br/>
-      </w:r>
-      <w:r>
-        <w:rPr>
-          <w:rStyle w:val="VerbatimChar"/>
-          <w:lang w:val="pt-BR"/>
-        </w:rPr>
-        <w:t>Objeto Ativo</w:t>
-      </w:r>
-      <w:r>
-        <w:rPr>
-          <w:lang w:val="pt-BR"/>
-        </w:rPr>
-        <w:br/>
-      </w:r>
-      <w:r>
-        <w:rPr>
-          <w:rStyle w:val="VerbatimChar"/>
-          <w:lang w:val="pt-BR"/>
-        </w:rPr>
-        <w:t xml:space="preserve">      ↓</w:t>
-      </w:r>
-      <w:r>
-        <w:rPr>
-          <w:lang w:val="pt-BR"/>
-        </w:rPr>
-        <w:br/>
-      </w:r>
-      <w:r>
-        <w:rPr>
-          <w:rStyle w:val="VerbatimChar"/>
-          <w:lang w:val="pt-BR"/>
-        </w:rPr>
-        <w:t>Interface gráfica</w:t>
-      </w:r>
-    </w:p>
-    <w:p>
-      <w:pPr>
-        <w:pStyle w:val="FirstParagraph"/>
-        <w:jc w:val="both"/>
-        <w:rPr>
-          <w:lang w:val="pt-BR"/>
-        </w:rPr>
-      </w:pPr>
+        <w:t>Objetivos</w:t>
+      </w:r>
+      <w:proofErr w:type="spellEnd"/>
       <w:r>
         <w:rPr>
           <w:b/>
           <w:bCs/>
+        </w:rPr>
+        <w:t>:</w:t>
+      </w:r>
+    </w:p>
+    <w:p>
+      <w:pPr>
+        <w:pStyle w:val="Compact"/>
+        <w:numPr>
+          <w:ilvl w:val="0"/>
+          <w:numId w:val="18"/>
+        </w:numPr>
+        <w:jc w:val="both"/>
+        <w:rPr>
+          <w:lang w:val="pt-BR"/>
+        </w:rPr>
+      </w:pPr>
+      <w:r>
+        <w:rPr>
+          <w:lang w:val="pt-BR"/>
+        </w:rPr>
+        <w:t>integrar o serviço externo de informações financeiras;</w:t>
+      </w:r>
+    </w:p>
+    <w:p>
+      <w:pPr>
+        <w:pStyle w:val="Compact"/>
+        <w:numPr>
+          <w:ilvl w:val="0"/>
+          <w:numId w:val="18"/>
+        </w:numPr>
+        <w:jc w:val="both"/>
+      </w:pPr>
+      <w:proofErr w:type="spellStart"/>
+      <w:r>
+        <w:t>implementar</w:t>
+      </w:r>
+      <w:proofErr w:type="spellEnd"/>
+      <w:r>
+        <w:t xml:space="preserve"> </w:t>
+      </w:r>
+      <w:proofErr w:type="spellStart"/>
+      <w:r>
+        <w:t>pesquisa</w:t>
+      </w:r>
+      <w:proofErr w:type="spellEnd"/>
+      <w:r>
+        <w:t xml:space="preserve"> de </w:t>
+      </w:r>
+      <w:proofErr w:type="spellStart"/>
+      <w:r>
+        <w:t>ativos</w:t>
+      </w:r>
+      <w:proofErr w:type="spellEnd"/>
+      <w:r>
+        <w:t>;</w:t>
+      </w:r>
+    </w:p>
+    <w:p>
+      <w:pPr>
+        <w:pStyle w:val="Compact"/>
+        <w:numPr>
+          <w:ilvl w:val="0"/>
+          <w:numId w:val="18"/>
+        </w:numPr>
+        <w:jc w:val="both"/>
+      </w:pPr>
+      <w:r>
+        <w:t>obter cotações reais;</w:t>
+      </w:r>
+    </w:p>
+    <w:p>
+      <w:pPr>
+        <w:pStyle w:val="Compact"/>
+        <w:numPr>
+          <w:ilvl w:val="0"/>
+          <w:numId w:val="18"/>
+        </w:numPr>
+        <w:jc w:val="both"/>
+        <w:rPr>
+          <w:lang w:val="pt-BR"/>
+        </w:rPr>
+      </w:pPr>
+      <w:r>
+        <w:rPr>
+          <w:lang w:val="pt-BR"/>
+        </w:rPr>
+        <w:t>apresentar informações recebidas na interface;</w:t>
+      </w:r>
+    </w:p>
+    <w:p>
+      <w:pPr>
+        <w:pStyle w:val="Compact"/>
+        <w:numPr>
+          <w:ilvl w:val="0"/>
+          <w:numId w:val="18"/>
+        </w:numPr>
+        <w:jc w:val="both"/>
+      </w:pPr>
+      <w:proofErr w:type="spellStart"/>
+      <w:r>
+        <w:t>tratar</w:t>
+      </w:r>
+      <w:proofErr w:type="spellEnd"/>
+      <w:r>
+        <w:t xml:space="preserve"> </w:t>
+      </w:r>
+      <w:proofErr w:type="spellStart"/>
+      <w:r>
+        <w:t>falhas</w:t>
+      </w:r>
+      <w:proofErr w:type="spellEnd"/>
+      <w:r>
+        <w:t xml:space="preserve"> de </w:t>
+      </w:r>
+      <w:proofErr w:type="spellStart"/>
+      <w:r>
+        <w:t>conexão</w:t>
+      </w:r>
+      <w:proofErr w:type="spellEnd"/>
+      <w:r>
+        <w:t>;</w:t>
+      </w:r>
+    </w:p>
+    <w:p>
+      <w:pPr>
+        <w:pStyle w:val="Compact"/>
+        <w:numPr>
+          <w:ilvl w:val="0"/>
+          <w:numId w:val="18"/>
+        </w:numPr>
+        <w:jc w:val="both"/>
+      </w:pPr>
+      <w:r>
+        <w:t>tratar ativos inexistentes;</w:t>
+      </w:r>
+    </w:p>
+    <w:p>
+      <w:pPr>
+        <w:pStyle w:val="Compact"/>
+        <w:numPr>
+          <w:ilvl w:val="0"/>
+          <w:numId w:val="18"/>
+        </w:numPr>
+        <w:jc w:val="both"/>
+        <w:rPr>
+          <w:lang w:val="pt-BR"/>
+        </w:rPr>
+      </w:pPr>
+      <w:r>
+        <w:rPr>
+          <w:lang w:val="pt-BR"/>
+        </w:rPr>
+        <w:t>integrar pelo menos um fluxo completo entre interface, serviços, objetos e banco de dados;</w:t>
+      </w:r>
+    </w:p>
+    <w:p>
+      <w:pPr>
+        <w:pStyle w:val="Compact"/>
+        <w:numPr>
+          <w:ilvl w:val="0"/>
+          <w:numId w:val="18"/>
+        </w:numPr>
+        <w:jc w:val="both"/>
+        <w:rPr>
+          <w:lang w:val="pt-BR"/>
+        </w:rPr>
+      </w:pPr>
+      <w:r>
+        <w:rPr>
+          <w:lang w:val="pt-BR"/>
+        </w:rPr>
+        <w:t>revisar arquitetura e principais classes;</w:t>
+      </w:r>
+    </w:p>
+    <w:p>
+      <w:pPr>
+        <w:pStyle w:val="Compact"/>
+        <w:numPr>
+          <w:ilvl w:val="0"/>
+          <w:numId w:val="18"/>
+        </w:numPr>
+        <w:jc w:val="both"/>
+        <w:rPr>
+          <w:lang w:val="pt-BR"/>
+        </w:rPr>
+      </w:pPr>
+      <w:r>
+        <w:rPr>
+          <w:lang w:val="pt-BR"/>
+        </w:rPr>
+        <w:t>preparar demonstração da versão parcial.</w:t>
+      </w:r>
+    </w:p>
+    <w:p>
+      <w:pPr>
+        <w:pStyle w:val="FirstParagraph"/>
+        <w:jc w:val="both"/>
+        <w:rPr>
+          <w:lang w:val="pt-BR"/>
+        </w:rPr>
+      </w:pPr>
+      <w:r>
+        <w:rPr>
+          <w:lang w:val="pt-BR"/>
+        </w:rPr>
+        <w:t>Até essa etapa, pretende-se possuir pelo menos os seguintes fluxos funcionais:</w:t>
+      </w:r>
+    </w:p>
+    <w:p>
+      <w:pPr>
+        <w:pStyle w:val="SourceCode"/>
+        <w:rPr>
+          <w:lang w:val="pt-BR"/>
+        </w:rPr>
+      </w:pPr>
+      <w:r>
+        <w:rPr>
+          <w:rStyle w:val="VerbatimChar"/>
+          <w:lang w:val="pt-BR"/>
+        </w:rPr>
+        <w:t>Interface</w:t>
+      </w:r>
+      <w:r>
+        <w:rPr>
+          <w:lang w:val="pt-BR"/>
+        </w:rPr>
+        <w:br/>
+      </w:r>
+      <w:r>
+        <w:rPr>
+          <w:rStyle w:val="VerbatimChar"/>
+          <w:lang w:val="pt-BR"/>
+        </w:rPr>
+        <w:t xml:space="preserve">   ↓</w:t>
+      </w:r>
+      <w:r>
+        <w:rPr>
+          <w:lang w:val="pt-BR"/>
+        </w:rPr>
+        <w:br/>
+      </w:r>
+      <w:r>
+        <w:rPr>
+          <w:rStyle w:val="VerbatimChar"/>
+          <w:lang w:val="pt-BR"/>
+        </w:rPr>
+        <w:t>Criar carteira</w:t>
+      </w:r>
+      <w:r>
+        <w:rPr>
+          <w:lang w:val="pt-BR"/>
+        </w:rPr>
+        <w:br/>
+      </w:r>
+      <w:r>
+        <w:rPr>
+          <w:rStyle w:val="VerbatimChar"/>
+          <w:lang w:val="pt-BR"/>
+        </w:rPr>
+        <w:t xml:space="preserve">   ↓</w:t>
+      </w:r>
+      <w:r>
+        <w:rPr>
+          <w:lang w:val="pt-BR"/>
+        </w:rPr>
+        <w:br/>
+      </w:r>
+      <w:r>
+        <w:rPr>
+          <w:rStyle w:val="VerbatimChar"/>
+          <w:lang w:val="pt-BR"/>
+        </w:rPr>
+        <w:t>Objeto Carteira</w:t>
+      </w:r>
+      <w:r>
+        <w:rPr>
+          <w:lang w:val="pt-BR"/>
+        </w:rPr>
+        <w:br/>
+      </w:r>
+      <w:r>
+        <w:rPr>
+          <w:rStyle w:val="VerbatimChar"/>
+          <w:lang w:val="pt-BR"/>
+        </w:rPr>
+        <w:t xml:space="preserve">   ↓</w:t>
+      </w:r>
+      <w:r>
+        <w:rPr>
+          <w:lang w:val="pt-BR"/>
+        </w:rPr>
+        <w:br/>
+      </w:r>
+      <w:proofErr w:type="spellStart"/>
+      <w:r>
+        <w:rPr>
+          <w:rStyle w:val="VerbatimChar"/>
+          <w:lang w:val="pt-BR"/>
+        </w:rPr>
+        <w:t>Repository</w:t>
+      </w:r>
+      <w:proofErr w:type="spellEnd"/>
+      <w:r>
+        <w:rPr>
+          <w:lang w:val="pt-BR"/>
+        </w:rPr>
+        <w:br/>
+      </w:r>
+      <w:r>
+        <w:rPr>
+          <w:rStyle w:val="VerbatimChar"/>
+          <w:lang w:val="pt-BR"/>
+        </w:rPr>
+        <w:t xml:space="preserve">   ↓</w:t>
+      </w:r>
+      <w:r>
+        <w:rPr>
+          <w:lang w:val="pt-BR"/>
+        </w:rPr>
+        <w:br/>
+      </w:r>
+      <w:proofErr w:type="spellStart"/>
+      <w:r>
+        <w:rPr>
+          <w:rStyle w:val="VerbatimChar"/>
+          <w:lang w:val="pt-BR"/>
+        </w:rPr>
+        <w:t>SQLite</w:t>
+      </w:r>
+      <w:proofErr w:type="spellEnd"/>
+    </w:p>
+    <w:p>
+      <w:pPr>
+        <w:pStyle w:val="FirstParagraph"/>
+        <w:rPr>
+          <w:lang w:val="pt-BR"/>
+        </w:rPr>
+      </w:pPr>
+      <w:r>
+        <w:rPr>
+          <w:lang w:val="pt-BR"/>
+        </w:rPr>
+        <w:t>e:</w:t>
+      </w:r>
+    </w:p>
+    <w:p>
+      <w:pPr>
+        <w:pStyle w:val="SourceCode"/>
+        <w:rPr>
+          <w:lang w:val="pt-BR"/>
+        </w:rPr>
+      </w:pPr>
+      <w:r>
+        <w:rPr>
+          <w:rStyle w:val="VerbatimChar"/>
+          <w:lang w:val="pt-BR"/>
+        </w:rPr>
+        <w:t>Pesquisar ativo</w:t>
+      </w:r>
+      <w:r>
+        <w:rPr>
+          <w:lang w:val="pt-BR"/>
+        </w:rPr>
+        <w:br/>
+      </w:r>
+      <w:r>
+        <w:rPr>
+          <w:rStyle w:val="VerbatimChar"/>
+          <w:lang w:val="pt-BR"/>
+        </w:rPr>
+        <w:t xml:space="preserve">      ↓</w:t>
+      </w:r>
+      <w:r>
+        <w:rPr>
+          <w:lang w:val="pt-BR"/>
+        </w:rPr>
+        <w:br/>
+      </w:r>
+      <w:r>
+        <w:rPr>
+          <w:rStyle w:val="VerbatimChar"/>
+          <w:lang w:val="pt-BR"/>
+        </w:rPr>
+        <w:t>Serviço de mercado</w:t>
+      </w:r>
+      <w:r>
+        <w:rPr>
+          <w:lang w:val="pt-BR"/>
+        </w:rPr>
+        <w:br/>
+      </w:r>
+      <w:r>
+        <w:rPr>
+          <w:rStyle w:val="VerbatimChar"/>
+          <w:lang w:val="pt-BR"/>
+        </w:rPr>
+        <w:t xml:space="preserve">      ↓</w:t>
+      </w:r>
+      <w:r>
+        <w:rPr>
+          <w:lang w:val="pt-BR"/>
+        </w:rPr>
+        <w:br/>
+      </w:r>
+      <w:r>
+        <w:rPr>
+          <w:rStyle w:val="VerbatimChar"/>
+          <w:lang w:val="pt-BR"/>
+        </w:rPr>
+        <w:t>API externa</w:t>
+      </w:r>
+      <w:r>
+        <w:rPr>
+          <w:lang w:val="pt-BR"/>
+        </w:rPr>
+        <w:br/>
+      </w:r>
+      <w:r>
+        <w:rPr>
+          <w:rStyle w:val="VerbatimChar"/>
+          <w:lang w:val="pt-BR"/>
+        </w:rPr>
+        <w:t xml:space="preserve">      ↓</w:t>
+      </w:r>
+      <w:r>
+        <w:rPr>
+          <w:lang w:val="pt-BR"/>
+        </w:rPr>
+        <w:br/>
+      </w:r>
+      <w:r>
+        <w:rPr>
+          <w:rStyle w:val="VerbatimChar"/>
+          <w:lang w:val="pt-BR"/>
+        </w:rPr>
+        <w:t>Objeto Ativo</w:t>
+      </w:r>
+      <w:r>
+        <w:rPr>
+          <w:lang w:val="pt-BR"/>
+        </w:rPr>
+        <w:br/>
+      </w:r>
+      <w:r>
+        <w:rPr>
+          <w:rStyle w:val="VerbatimChar"/>
+          <w:lang w:val="pt-BR"/>
+        </w:rPr>
+        <w:t xml:space="preserve">      ↓</w:t>
+      </w:r>
+      <w:r>
+        <w:rPr>
+          <w:lang w:val="pt-BR"/>
+        </w:rPr>
+        <w:br/>
+      </w:r>
+      <w:r>
+        <w:rPr>
+          <w:rStyle w:val="VerbatimChar"/>
+          <w:lang w:val="pt-BR"/>
+        </w:rPr>
+        <w:t>Interface gráfica</w:t>
+      </w:r>
+    </w:p>
+    <w:p>
+      <w:pPr>
+        <w:pStyle w:val="FirstParagraph"/>
+        <w:jc w:val="both"/>
+        <w:rPr>
+          <w:lang w:val="pt-BR"/>
+        </w:rPr>
+      </w:pPr>
+      <w:r>
+        <w:rPr>
+          <w:b/>
+          <w:bCs/>
           <w:lang w:val="pt-BR"/>
         </w:rPr>
         <w:t>Resultado esperado:</w:t>
@@ -5417,6 +5888,7 @@
         <w:rPr>
           <w:lang w:val="pt-BR"/>
         </w:rPr>
+        <w:lastRenderedPageBreak/>
         <w:t>30/09 — Apresentação Parcial de Desenvolvimento</w:t>
       </w:r>
     </w:p>
@@ -5444,8 +5916,21 @@
         </w:numPr>
         <w:jc w:val="both"/>
       </w:pPr>
-      <w:r>
-        <w:t>objetivo e escopo;</w:t>
+      <w:proofErr w:type="spellStart"/>
+      <w:r>
+        <w:t>objetivo</w:t>
+      </w:r>
+      <w:proofErr w:type="spellEnd"/>
+      <w:r>
+        <w:t xml:space="preserve"> e </w:t>
+      </w:r>
+      <w:proofErr w:type="spellStart"/>
+      <w:r>
+        <w:t>escopo</w:t>
+      </w:r>
+      <w:proofErr w:type="spellEnd"/>
+      <w:r>
+        <w:t>;</w:t>
       </w:r>
     </w:p>
     <w:p>
@@ -5541,8 +6026,29 @@
         </w:numPr>
         <w:jc w:val="both"/>
       </w:pPr>
-      <w:r>
-        <w:t>funcionalidades já implementadas;</w:t>
+      <w:proofErr w:type="spellStart"/>
+      <w:r>
+        <w:t>funcionalidades</w:t>
+      </w:r>
+      <w:proofErr w:type="spellEnd"/>
+      <w:r>
+        <w:t xml:space="preserve"> </w:t>
+      </w:r>
+      <w:proofErr w:type="spellStart"/>
+      <w:r>
+        <w:t>já</w:t>
+      </w:r>
+      <w:proofErr w:type="spellEnd"/>
+      <w:r>
+        <w:t xml:space="preserve"> </w:t>
+      </w:r>
+      <w:proofErr w:type="spellStart"/>
+      <w:r>
+        <w:t>implementadas</w:t>
+      </w:r>
+      <w:proofErr w:type="spellEnd"/>
+      <w:r>
+        <w:t>;</w:t>
       </w:r>
     </w:p>
     <w:p>
@@ -5602,7 +6108,6 @@
         <w:rPr>
           <w:lang w:val="pt-BR"/>
         </w:rPr>
-        <w:lastRenderedPageBreak/>
         <w:t>O objetivo é que a interface e sua lógica de navegação já estejam praticamente concluídas nessa etapa, permitindo concentrar o restante do desenvolvimento principalmente nas regras de negócio e funcionalidades.</w:t>
       </w:r>
     </w:p>
@@ -5687,8 +6192,29 @@
         </w:numPr>
         <w:jc w:val="both"/>
       </w:pPr>
-      <w:r>
-        <w:t>atualizar automaticamente posições;</w:t>
+      <w:proofErr w:type="spellStart"/>
+      <w:r>
+        <w:t>atualizar</w:t>
+      </w:r>
+      <w:proofErr w:type="spellEnd"/>
+      <w:r>
+        <w:t xml:space="preserve"> </w:t>
+      </w:r>
+      <w:proofErr w:type="spellStart"/>
+      <w:r>
+        <w:t>automaticamente</w:t>
+      </w:r>
+      <w:proofErr w:type="spellEnd"/>
+      <w:r>
+        <w:t xml:space="preserve"> </w:t>
+      </w:r>
+      <w:proofErr w:type="spellStart"/>
+      <w:r>
+        <w:t>posições</w:t>
+      </w:r>
+      <w:proofErr w:type="spellEnd"/>
+      <w:r>
+        <w:t>;</w:t>
       </w:r>
     </w:p>
     <w:p>
@@ -5745,8 +6271,37 @@
         </w:numPr>
         <w:jc w:val="both"/>
       </w:pPr>
-      <w:r>
-        <w:t>calcular lucro ou prejuízo;</w:t>
+      <w:proofErr w:type="spellStart"/>
+      <w:r>
+        <w:t>calcular</w:t>
+      </w:r>
+      <w:proofErr w:type="spellEnd"/>
+      <w:r>
+        <w:t xml:space="preserve"> </w:t>
+      </w:r>
+      <w:proofErr w:type="spellStart"/>
+      <w:r>
+        <w:t>lucro</w:t>
+      </w:r>
+      <w:proofErr w:type="spellEnd"/>
+      <w:r>
+        <w:t xml:space="preserve"> </w:t>
+      </w:r>
+      <w:proofErr w:type="spellStart"/>
+      <w:r>
+        <w:t>ou</w:t>
+      </w:r>
+      <w:proofErr w:type="spellEnd"/>
+      <w:r>
+        <w:t xml:space="preserve"> </w:t>
+      </w:r>
+      <w:proofErr w:type="spellStart"/>
+      <w:r>
+        <w:t>prejuízo</w:t>
+      </w:r>
+      <w:proofErr w:type="spellEnd"/>
+      <w:r>
+        <w:t>;</w:t>
       </w:r>
     </w:p>
     <w:p>
@@ -5898,8 +6453,22 @@
         </w:numPr>
         <w:jc w:val="both"/>
       </w:pPr>
-      <w:r>
-        <w:t>implementar evolução patrimonial;</w:t>
+      <w:proofErr w:type="spellStart"/>
+      <w:r>
+        <w:lastRenderedPageBreak/>
+        <w:t>implementar</w:t>
+      </w:r>
+      <w:proofErr w:type="spellEnd"/>
+      <w:r>
+        <w:t xml:space="preserve"> </w:t>
+      </w:r>
+      <w:proofErr w:type="spellStart"/>
+      <w:r>
+        <w:t>evolução</w:t>
+      </w:r>
+      <w:proofErr w:type="spellEnd"/>
+      <w:r>
+        <w:t xml:space="preserve"> patrimonial;</w:t>
       </w:r>
     </w:p>
     <w:p>
@@ -5969,8 +6538,21 @@
         </w:numPr>
         <w:jc w:val="both"/>
       </w:pPr>
-      <w:r>
-        <w:t>melhorar visualização dos dados.</w:t>
+      <w:proofErr w:type="spellStart"/>
+      <w:r>
+        <w:t>melhorar</w:t>
+      </w:r>
+      <w:proofErr w:type="spellEnd"/>
+      <w:r>
+        <w:t xml:space="preserve"> </w:t>
+      </w:r>
+      <w:proofErr w:type="spellStart"/>
+      <w:r>
+        <w:t>visualização</w:t>
+      </w:r>
+      <w:proofErr w:type="spellEnd"/>
+      <w:r>
+        <w:t xml:space="preserve"> dos dados.</w:t>
       </w:r>
     </w:p>
     <w:p>
@@ -6058,8 +6640,21 @@
         </w:numPr>
         <w:jc w:val="both"/>
       </w:pPr>
-      <w:r>
-        <w:t>armazenar alertas no banco;</w:t>
+      <w:proofErr w:type="spellStart"/>
+      <w:r>
+        <w:t>armazenar</w:t>
+      </w:r>
+      <w:proofErr w:type="spellEnd"/>
+      <w:r>
+        <w:t xml:space="preserve"> </w:t>
+      </w:r>
+      <w:proofErr w:type="spellStart"/>
+      <w:r>
+        <w:t>alertas</w:t>
+      </w:r>
+      <w:proofErr w:type="spellEnd"/>
+      <w:r>
+        <w:t xml:space="preserve"> no banco;</w:t>
       </w:r>
     </w:p>
     <w:p>
@@ -6110,7 +6705,6 @@
         <w:rPr>
           <w:lang w:val="pt-BR"/>
         </w:rPr>
-        <w:lastRenderedPageBreak/>
         <w:t>implementar, caso viável, envio de alertas por e-mail;</w:t>
       </w:r>
     </w:p>
@@ -6123,8 +6717,29 @@
         </w:numPr>
         <w:jc w:val="both"/>
       </w:pPr>
-      <w:r>
-        <w:t>revisar tratamento de exceções.</w:t>
+      <w:proofErr w:type="spellStart"/>
+      <w:r>
+        <w:t>revisar</w:t>
+      </w:r>
+      <w:proofErr w:type="spellEnd"/>
+      <w:r>
+        <w:t xml:space="preserve"> </w:t>
+      </w:r>
+      <w:proofErr w:type="spellStart"/>
+      <w:r>
+        <w:t>tratamento</w:t>
+      </w:r>
+      <w:proofErr w:type="spellEnd"/>
+      <w:r>
+        <w:t xml:space="preserve"> de </w:t>
+      </w:r>
+      <w:proofErr w:type="spellStart"/>
+      <w:r>
+        <w:t>exceções</w:t>
+      </w:r>
+      <w:proofErr w:type="spellEnd"/>
+      <w:r>
+        <w:t>.</w:t>
       </w:r>
     </w:p>
     <w:p>
@@ -6206,8 +6821,21 @@
         </w:numPr>
         <w:jc w:val="both"/>
       </w:pPr>
-      <w:r>
-        <w:t>planejamento financeiro;</w:t>
+      <w:proofErr w:type="spellStart"/>
+      <w:r>
+        <w:t>planejamento</w:t>
+      </w:r>
+      <w:proofErr w:type="spellEnd"/>
+      <w:r>
+        <w:t xml:space="preserve"> </w:t>
+      </w:r>
+      <w:proofErr w:type="spellStart"/>
+      <w:r>
+        <w:t>financeiro</w:t>
+      </w:r>
+      <w:proofErr w:type="spellEnd"/>
+      <w:r>
+        <w:t>;</w:t>
       </w:r>
     </w:p>
     <w:p>
@@ -6238,8 +6866,13 @@
         </w:numPr>
         <w:jc w:val="both"/>
       </w:pPr>
-      <w:r>
-        <w:t>objetivos financeiros;</w:t>
+      <w:proofErr w:type="spellStart"/>
+      <w:r>
+        <w:t>objetivos</w:t>
+      </w:r>
+      <w:proofErr w:type="spellEnd"/>
+      <w:r>
+        <w:t xml:space="preserve"> financeiros;</w:t>
       </w:r>
     </w:p>
     <w:p>
@@ -6289,8 +6922,21 @@
         </w:numPr>
         <w:jc w:val="both"/>
       </w:pPr>
-      <w:r>
-        <w:t>novos indicadores;</w:t>
+      <w:proofErr w:type="spellStart"/>
+      <w:r>
+        <w:t>novos</w:t>
+      </w:r>
+      <w:proofErr w:type="spellEnd"/>
+      <w:r>
+        <w:t xml:space="preserve"> </w:t>
+      </w:r>
+      <w:proofErr w:type="spellStart"/>
+      <w:r>
+        <w:t>indicadores</w:t>
+      </w:r>
+      <w:proofErr w:type="spellEnd"/>
+      <w:r>
+        <w:t>;</w:t>
       </w:r>
     </w:p>
     <w:p>
@@ -6364,6 +7010,7 @@
         <w:rPr>
           <w:lang w:val="pt-BR"/>
         </w:rPr>
+        <w:lastRenderedPageBreak/>
         <w:t>29/10 a 02/11 — Testes e finalização</w:t>
       </w:r>
     </w:p>
@@ -6412,8 +7059,21 @@
         </w:numPr>
         <w:jc w:val="both"/>
       </w:pPr>
-      <w:r>
-        <w:t>corrigir erros;</w:t>
+      <w:proofErr w:type="spellStart"/>
+      <w:r>
+        <w:t>corrigir</w:t>
+      </w:r>
+      <w:proofErr w:type="spellEnd"/>
+      <w:r>
+        <w:t xml:space="preserve"> </w:t>
+      </w:r>
+      <w:proofErr w:type="spellStart"/>
+      <w:r>
+        <w:t>erros</w:t>
+      </w:r>
+      <w:proofErr w:type="spellEnd"/>
+      <w:r>
+        <w:t>;</w:t>
       </w:r>
     </w:p>
     <w:p>
@@ -6496,8 +7156,37 @@
         </w:numPr>
         <w:jc w:val="both"/>
       </w:pPr>
-      <w:r>
-        <w:t>realizar refatoração quando necessária;</w:t>
+      <w:proofErr w:type="spellStart"/>
+      <w:r>
+        <w:t>realizar</w:t>
+      </w:r>
+      <w:proofErr w:type="spellEnd"/>
+      <w:r>
+        <w:t xml:space="preserve"> </w:t>
+      </w:r>
+      <w:proofErr w:type="spellStart"/>
+      <w:r>
+        <w:t>refatoração</w:t>
+      </w:r>
+      <w:proofErr w:type="spellEnd"/>
+      <w:r>
+        <w:t xml:space="preserve"> </w:t>
+      </w:r>
+      <w:proofErr w:type="spellStart"/>
+      <w:r>
+        <w:t>quando</w:t>
+      </w:r>
+      <w:proofErr w:type="spellEnd"/>
+      <w:r>
+        <w:t xml:space="preserve"> </w:t>
+      </w:r>
+      <w:proofErr w:type="spellStart"/>
+      <w:r>
+        <w:t>necessária</w:t>
+      </w:r>
+      <w:proofErr w:type="spellEnd"/>
+      <w:r>
+        <w:t>;</w:t>
       </w:r>
     </w:p>
     <w:p>
@@ -6541,10 +7230,20 @@
         </w:numPr>
         <w:jc w:val="both"/>
       </w:pPr>
+      <w:proofErr w:type="spellStart"/>
       <w:proofErr w:type="gramStart"/>
       <w:r>
-        <w:t>preparar apresentação</w:t>
-      </w:r>
+        <w:t>preparar</w:t>
+      </w:r>
+      <w:proofErr w:type="spellEnd"/>
+      <w:r>
+        <w:t xml:space="preserve"> </w:t>
+      </w:r>
+      <w:proofErr w:type="spellStart"/>
+      <w:r>
+        <w:t>apresentação</w:t>
+      </w:r>
+      <w:proofErr w:type="spellEnd"/>
       <w:proofErr w:type="gramEnd"/>
       <w:r>
         <w:t xml:space="preserve"> final.</w:t>
@@ -6564,7 +7263,6 @@
           <w:bCs/>
           <w:lang w:val="pt-BR"/>
         </w:rPr>
-        <w:lastRenderedPageBreak/>
         <w:t>Resultado esperado:</w:t>
       </w:r>
       <w:r>
@@ -6582,8 +7280,21 @@
       <w:bookmarkStart w:id="31" w:name="preparação-da-apresentação"/>
       <w:bookmarkEnd w:id="30"/>
       <w:r>
-        <w:t>03/11 — Preparação da apresentação</w:t>
-      </w:r>
+        <w:t xml:space="preserve">03/11 — </w:t>
+      </w:r>
+      <w:proofErr w:type="spellStart"/>
+      <w:r>
+        <w:t>Preparação</w:t>
+      </w:r>
+      <w:proofErr w:type="spellEnd"/>
+      <w:r>
+        <w:t xml:space="preserve"> da </w:t>
+      </w:r>
+      <w:proofErr w:type="spellStart"/>
+      <w:r>
+        <w:t>apresentação</w:t>
+      </w:r>
+      <w:proofErr w:type="spellEnd"/>
     </w:p>
     <w:p>
       <w:pPr>
@@ -6626,8 +7337,29 @@
         </w:numPr>
         <w:jc w:val="both"/>
       </w:pPr>
-      <w:r>
-        <w:t>realizar ensaio completo;</w:t>
+      <w:proofErr w:type="spellStart"/>
+      <w:r>
+        <w:t>realizar</w:t>
+      </w:r>
+      <w:proofErr w:type="spellEnd"/>
+      <w:r>
+        <w:t xml:space="preserve"> </w:t>
+      </w:r>
+      <w:proofErr w:type="spellStart"/>
+      <w:r>
+        <w:t>ensaio</w:t>
+      </w:r>
+      <w:proofErr w:type="spellEnd"/>
+      <w:r>
+        <w:t xml:space="preserve"> </w:t>
+      </w:r>
+      <w:proofErr w:type="spellStart"/>
+      <w:r>
+        <w:t>completo</w:t>
+      </w:r>
+      <w:proofErr w:type="spellEnd"/>
+      <w:r>
+        <w:t>;</w:t>
       </w:r>
     </w:p>
     <w:p>
@@ -6729,8 +7461,29 @@
         </w:numPr>
         <w:jc w:val="both"/>
       </w:pPr>
-      <w:r>
-        <w:t>preparar explicação das integrações;</w:t>
+      <w:proofErr w:type="spellStart"/>
+      <w:r>
+        <w:t>preparar</w:t>
+      </w:r>
+      <w:proofErr w:type="spellEnd"/>
+      <w:r>
+        <w:t xml:space="preserve"> </w:t>
+      </w:r>
+      <w:proofErr w:type="spellStart"/>
+      <w:r>
+        <w:t>explicação</w:t>
+      </w:r>
+      <w:proofErr w:type="spellEnd"/>
+      <w:r>
+        <w:t xml:space="preserve"> das </w:t>
+      </w:r>
+      <w:proofErr w:type="spellStart"/>
+      <w:r>
+        <w:t>integrações</w:t>
+      </w:r>
+      <w:proofErr w:type="spellEnd"/>
+      <w:r>
+        <w:t>;</w:t>
       </w:r>
     </w:p>
     <w:p>
@@ -6789,8 +7542,18 @@
           <w:bCs/>
           <w:lang w:val="pt-BR"/>
         </w:rPr>
-        <w:t>Nexo Invest</w:t>
-      </w:r>
+        <w:t xml:space="preserve">Nexo </w:t>
+      </w:r>
+      <w:proofErr w:type="spellStart"/>
+      <w:r>
+        <w:rPr>
+          <w:b/>
+          <w:bCs/>
+          <w:lang w:val="pt-BR"/>
+        </w:rPr>
+        <w:t>Invest</w:t>
+      </w:r>
+      <w:proofErr w:type="spellEnd"/>
       <w:r>
         <w:rPr>
           <w:lang w:val="pt-BR"/>
@@ -6813,6 +7576,7 @@
         <w:rPr>
           <w:lang w:val="pt-BR"/>
         </w:rPr>
+        <w:lastRenderedPageBreak/>
         <w:t>10. Resultados esperados</w:t>
       </w:r>
     </w:p>

</xml_diff>